<commit_message>
Fix report formatting: label-only bold, uncropped images, project-based abbreviations and references
</commit_message>
<xml_diff>
--- a/report/Lustro-Report by Ashwin Sunuwar.docx
+++ b/report/Lustro-Report by Ashwin Sunuwar.docx
@@ -4494,43 +4494,14 @@
       </w:pPr>
       <w:r>
         <w:rPr>
-          <w:rFonts w:ascii="Times New Roman" w:hAnsi="Times New Roman" w:eastAsia="Times New Roman" w:cs="Times New Roman"/>
           <w:b/>
           <w:bCs/>
-          <w:sz w:val="24"/>
-          <w:szCs w:val="24"/>
-          <w:rtl w:val="0"/>
-        </w:rPr>
-        <w:t xml:space="preserve">OJT</w:t>
-      </w:r>
-      <w:r>
-        <w:rPr>
           <w:rFonts w:ascii="Times New Roman" w:hAnsi="Times New Roman" w:eastAsia="Times New Roman" w:cs="Times New Roman"/>
           <w:sz w:val="24"/>
           <w:szCs w:val="24"/>
           <w:rtl w:val="0"/>
         </w:rPr>
-        <w:t xml:space="preserve"> :  On-the-Job Training</w:t>
-      </w:r>
-      <w:r/>
-    </w:p>
-    <w:p>
-      <w:pPr>
-        <w:pBdr/>
-        <w:spacing w:after="60" w:before="60" w:line="480" w:lineRule="auto"/>
-        <w:ind w:hanging="720" w:left="720"/>
-        <w:rPr/>
-      </w:pPr>
-      <w:r>
-        <w:rPr>
-          <w:rFonts w:ascii="Times New Roman" w:hAnsi="Times New Roman" w:eastAsia="Times New Roman" w:cs="Times New Roman"/>
-          <w:b/>
-          <w:bCs/>
-          <w:sz w:val="24"/>
-          <w:szCs w:val="24"/>
-          <w:rtl w:val="0"/>
-        </w:rPr>
-        <w:t xml:space="preserve">CRM</w:t>
+        <w:t xml:space="preserve">OJT</w:t>
       </w:r>
       <w:r>
         <w:rPr>
@@ -4539,9 +4510,8 @@
           <w:szCs w:val="24"/>
           <w:rtl w:val="0"/>
         </w:rPr>
-        <w:t xml:space="preserve"> :  Customer Relationship Management</w:t>
+        <w:t xml:space="preserve"> :  On-the-Job Training</w:t>
       </w:r>
-      <w:r/>
     </w:p>
     <w:p>
       <w:pPr>
@@ -4552,43 +4522,14 @@
       </w:pPr>
       <w:r>
         <w:rPr>
-          <w:rFonts w:ascii="Times New Roman" w:hAnsi="Times New Roman" w:eastAsia="Times New Roman" w:cs="Times New Roman"/>
           <w:b/>
           <w:bCs/>
-          <w:sz w:val="24"/>
-          <w:szCs w:val="24"/>
-          <w:rtl w:val="0"/>
-        </w:rPr>
-        <w:t xml:space="preserve">API</w:t>
-      </w:r>
-      <w:r>
-        <w:rPr>
           <w:rFonts w:ascii="Times New Roman" w:hAnsi="Times New Roman" w:eastAsia="Times New Roman" w:cs="Times New Roman"/>
           <w:sz w:val="24"/>
           <w:szCs w:val="24"/>
           <w:rtl w:val="0"/>
         </w:rPr>
-        <w:t xml:space="preserve"> :  Application Programming Interface</w:t>
-      </w:r>
-      <w:r/>
-    </w:p>
-    <w:p>
-      <w:pPr>
-        <w:pBdr/>
-        <w:spacing w:after="60" w:before="60" w:line="480" w:lineRule="auto"/>
-        <w:ind w:hanging="720" w:left="720"/>
-        <w:rPr/>
-      </w:pPr>
-      <w:r>
-        <w:rPr>
-          <w:rFonts w:ascii="Times New Roman" w:hAnsi="Times New Roman" w:eastAsia="Times New Roman" w:cs="Times New Roman"/>
-          <w:b/>
-          <w:bCs/>
-          <w:sz w:val="24"/>
-          <w:szCs w:val="24"/>
-          <w:rtl w:val="0"/>
-        </w:rPr>
-        <w:t xml:space="preserve">JWT</w:t>
+        <w:t xml:space="preserve">API</w:t>
       </w:r>
       <w:r>
         <w:rPr>
@@ -4597,9 +4538,8 @@
           <w:szCs w:val="24"/>
           <w:rtl w:val="0"/>
         </w:rPr>
-        <w:t xml:space="preserve"> :  JSON Web Token</w:t>
+        <w:t xml:space="preserve"> :  Application Programming Interface</w:t>
       </w:r>
-      <w:r/>
     </w:p>
     <w:p>
       <w:pPr>
@@ -4610,43 +4550,14 @@
       </w:pPr>
       <w:r>
         <w:rPr>
-          <w:rFonts w:ascii="Times New Roman" w:hAnsi="Times New Roman" w:eastAsia="Times New Roman" w:cs="Times New Roman"/>
           <w:b/>
           <w:bCs/>
-          <w:sz w:val="24"/>
-          <w:szCs w:val="24"/>
-          <w:rtl w:val="0"/>
-        </w:rPr>
-        <w:t xml:space="preserve">SPA</w:t>
-      </w:r>
-      <w:r>
-        <w:rPr>
           <w:rFonts w:ascii="Times New Roman" w:hAnsi="Times New Roman" w:eastAsia="Times New Roman" w:cs="Times New Roman"/>
           <w:sz w:val="24"/>
           <w:szCs w:val="24"/>
           <w:rtl w:val="0"/>
         </w:rPr>
-        <w:t xml:space="preserve"> :  Single Page Application</w:t>
-      </w:r>
-      <w:r/>
-    </w:p>
-    <w:p>
-      <w:pPr>
-        <w:pBdr/>
-        <w:spacing w:after="60" w:before="60" w:line="480" w:lineRule="auto"/>
-        <w:ind w:hanging="720" w:left="720"/>
-        <w:rPr/>
-      </w:pPr>
-      <w:r>
-        <w:rPr>
-          <w:rFonts w:ascii="Times New Roman" w:hAnsi="Times New Roman" w:eastAsia="Times New Roman" w:cs="Times New Roman"/>
-          <w:b/>
-          <w:bCs/>
-          <w:sz w:val="24"/>
-          <w:szCs w:val="24"/>
-          <w:rtl w:val="0"/>
-        </w:rPr>
-        <w:t xml:space="preserve">DRF</w:t>
+        <w:t xml:space="preserve">JWT</w:t>
       </w:r>
       <w:r>
         <w:rPr>
@@ -4655,9 +4566,8 @@
           <w:szCs w:val="24"/>
           <w:rtl w:val="0"/>
         </w:rPr>
-        <w:t xml:space="preserve"> :  Django REST Framework</w:t>
+        <w:t xml:space="preserve"> :  JSON Web Token</w:t>
       </w:r>
-      <w:r/>
     </w:p>
     <w:p>
       <w:pPr>
@@ -4668,43 +4578,14 @@
       </w:pPr>
       <w:r>
         <w:rPr>
-          <w:rFonts w:ascii="Times New Roman" w:hAnsi="Times New Roman" w:eastAsia="Times New Roman" w:cs="Times New Roman"/>
           <w:b/>
           <w:bCs/>
-          <w:sz w:val="24"/>
-          <w:szCs w:val="24"/>
-          <w:rtl w:val="0"/>
-        </w:rPr>
-        <w:t xml:space="preserve">ORM</w:t>
-      </w:r>
-      <w:r>
-        <w:rPr>
           <w:rFonts w:ascii="Times New Roman" w:hAnsi="Times New Roman" w:eastAsia="Times New Roman" w:cs="Times New Roman"/>
           <w:sz w:val="24"/>
           <w:szCs w:val="24"/>
           <w:rtl w:val="0"/>
         </w:rPr>
-        <w:t xml:space="preserve"> :  Object-Relational Mapping</w:t>
-      </w:r>
-      <w:r/>
-    </w:p>
-    <w:p>
-      <w:pPr>
-        <w:pBdr/>
-        <w:spacing w:after="60" w:before="60" w:line="480" w:lineRule="auto"/>
-        <w:ind w:hanging="720" w:left="720"/>
-        <w:rPr/>
-      </w:pPr>
-      <w:r>
-        <w:rPr>
-          <w:rFonts w:ascii="Times New Roman" w:hAnsi="Times New Roman" w:eastAsia="Times New Roman" w:cs="Times New Roman"/>
-          <w:b/>
-          <w:bCs/>
-          <w:sz w:val="24"/>
-          <w:szCs w:val="24"/>
-          <w:rtl w:val="0"/>
-        </w:rPr>
-        <w:t xml:space="preserve">LLM</w:t>
+        <w:t xml:space="preserve">SPA</w:t>
       </w:r>
       <w:r>
         <w:rPr>
@@ -4713,9 +4594,8 @@
           <w:szCs w:val="24"/>
           <w:rtl w:val="0"/>
         </w:rPr>
-        <w:t xml:space="preserve"> :  Large Language Model</w:t>
+        <w:t xml:space="preserve"> :  Single Page Application</w:t>
       </w:r>
-      <w:r/>
     </w:p>
     <w:p>
       <w:pPr>
@@ -4726,25 +4606,136 @@
       </w:pPr>
       <w:r>
         <w:rPr>
-          <w:rFonts w:ascii="Times New Roman" w:hAnsi="Times New Roman" w:eastAsia="Times New Roman" w:cs="Times New Roman"/>
           <w:b/>
           <w:bCs/>
-          <w:sz w:val="24"/>
-          <w:szCs w:val="24"/>
-          <w:rtl w:val="0"/>
-        </w:rPr>
-        <w:t xml:space="preserve">UI/UX</w:t>
-      </w:r>
-      <w:r>
-        <w:rPr>
           <w:rFonts w:ascii="Times New Roman" w:hAnsi="Times New Roman" w:eastAsia="Times New Roman" w:cs="Times New Roman"/>
           <w:sz w:val="24"/>
           <w:szCs w:val="24"/>
           <w:rtl w:val="0"/>
         </w:rPr>
-        <w:t xml:space="preserve"> :  User Interface / User Experience</w:t>
+        <w:t xml:space="preserve">DRF</w:t>
       </w:r>
-      <w:r/>
+      <w:r>
+        <w:rPr>
+          <w:rFonts w:ascii="Times New Roman" w:hAnsi="Times New Roman" w:eastAsia="Times New Roman" w:cs="Times New Roman"/>
+          <w:sz w:val="24"/>
+          <w:szCs w:val="24"/>
+          <w:rtl w:val="0"/>
+        </w:rPr>
+        <w:t xml:space="preserve"> :  Django REST Framework</w:t>
+      </w:r>
+    </w:p>
+    <w:p>
+      <w:pPr>
+        <w:pBdr/>
+        <w:spacing w:after="60" w:before="60" w:line="480" w:lineRule="auto"/>
+        <w:ind w:hanging="720" w:left="720"/>
+        <w:rPr/>
+      </w:pPr>
+      <w:r>
+        <w:rPr>
+          <w:b/>
+          <w:bCs/>
+          <w:rFonts w:ascii="Times New Roman" w:hAnsi="Times New Roman" w:eastAsia="Times New Roman" w:cs="Times New Roman"/>
+          <w:sz w:val="24"/>
+          <w:szCs w:val="24"/>
+          <w:rtl w:val="0"/>
+        </w:rPr>
+        <w:t xml:space="preserve">ORM</w:t>
+      </w:r>
+      <w:r>
+        <w:rPr>
+          <w:rFonts w:ascii="Times New Roman" w:hAnsi="Times New Roman" w:eastAsia="Times New Roman" w:cs="Times New Roman"/>
+          <w:sz w:val="24"/>
+          <w:szCs w:val="24"/>
+          <w:rtl w:val="0"/>
+        </w:rPr>
+        <w:t xml:space="preserve"> :  Object-Relational Mapping</w:t>
+      </w:r>
+    </w:p>
+    <w:p>
+      <w:pPr>
+        <w:pBdr/>
+        <w:spacing w:after="60" w:before="60" w:line="480" w:lineRule="auto"/>
+        <w:ind w:hanging="720" w:left="720"/>
+        <w:rPr/>
+      </w:pPr>
+      <w:r>
+        <w:rPr>
+          <w:b/>
+          <w:bCs/>
+          <w:rFonts w:ascii="Times New Roman" w:hAnsi="Times New Roman" w:eastAsia="Times New Roman" w:cs="Times New Roman"/>
+          <w:sz w:val="24"/>
+          <w:szCs w:val="24"/>
+          <w:rtl w:val="0"/>
+        </w:rPr>
+        <w:t xml:space="preserve">3D</w:t>
+      </w:r>
+      <w:r>
+        <w:rPr>
+          <w:rFonts w:ascii="Times New Roman" w:hAnsi="Times New Roman" w:eastAsia="Times New Roman" w:cs="Times New Roman"/>
+          <w:sz w:val="24"/>
+          <w:szCs w:val="24"/>
+          <w:rtl w:val="0"/>
+        </w:rPr>
+        <w:t xml:space="preserve"> :  Three-Dimensional Rendering (three.js)</w:t>
+      </w:r>
+    </w:p>
+    <w:p>
+      <w:pPr>
+        <w:pBdr/>
+        <w:spacing w:after="60" w:before="60" w:line="480" w:lineRule="auto"/>
+        <w:ind w:hanging="720" w:left="720"/>
+        <w:rPr/>
+      </w:pPr>
+      <w:r>
+        <w:rPr>
+          <w:b/>
+          <w:bCs/>
+          <w:rFonts w:ascii="Times New Roman" w:hAnsi="Times New Roman" w:eastAsia="Times New Roman" w:cs="Times New Roman"/>
+          <w:sz w:val="24"/>
+          <w:szCs w:val="24"/>
+          <w:rtl w:val="0"/>
+        </w:rPr>
+        <w:t xml:space="preserve">SEO</w:t>
+      </w:r>
+      <w:r>
+        <w:rPr>
+          <w:rFonts w:ascii="Times New Roman" w:hAnsi="Times New Roman" w:eastAsia="Times New Roman" w:cs="Times New Roman"/>
+          <w:sz w:val="24"/>
+          <w:szCs w:val="24"/>
+          <w:rtl w:val="0"/>
+        </w:rPr>
+        <w:t xml:space="preserve"> :  Search Engine Optimization</w:t>
+      </w:r>
+    </w:p>
+    <w:p>
+      <w:pPr>
+        <w:pBdr/>
+        <w:spacing w:after="60" w:before="60" w:line="480" w:lineRule="auto"/>
+        <w:ind w:hanging="720" w:left="720"/>
+        <w:rPr/>
+      </w:pPr>
+      <w:r>
+        <w:rPr>
+          <w:b/>
+          <w:bCs/>
+          <w:rFonts w:ascii="Times New Roman" w:hAnsi="Times New Roman" w:eastAsia="Times New Roman" w:cs="Times New Roman"/>
+          <w:sz w:val="24"/>
+          <w:szCs w:val="24"/>
+          <w:rtl w:val="0"/>
+        </w:rPr>
+        <w:t xml:space="preserve">COD</w:t>
+      </w:r>
+      <w:r>
+        <w:rPr>
+          <w:rFonts w:ascii="Times New Roman" w:hAnsi="Times New Roman" w:eastAsia="Times New Roman" w:cs="Times New Roman"/>
+          <w:sz w:val="24"/>
+          <w:szCs w:val="24"/>
+          <w:rtl w:val="0"/>
+        </w:rPr>
+        <w:t xml:space="preserve"> :  Cash on Delivery</w:t>
+      </w:r>
     </w:p>
     <w:p>
       <w:pPr>
@@ -4823,11 +4814,23 @@
       </w:pPr>
       <w:r>
         <w:rPr>
+          <w:rtl w:val="0"/>
+        </w:rPr>
+        <w:t xml:space="preserve"/>
+      </w:r>
+      <w:r>
+        <w:rPr>
           <w:b/>
           <w:bCs/>
           <w:rtl w:val="0"/>
         </w:rPr>
-        <w:t xml:space="preserve">Lustro is a full-stack luxury watch e-commerce platform that curates the world's most exceptional timepieces. It was designed to bring a private-boutique shopping experience online, combining an immersive 3D home experience, a concierge chat assistant, verified collector reviews, and a complete commerce workflow. While global platforms focus on wide-scale logistics, Lustro focuses on craftsmanship, curation, and personalized service for watch enthusiasts and collectors.</w:t>
+        <w:t xml:space="preserve">Lustro</w:t>
+      </w:r>
+      <w:r>
+        <w:rPr>
+          <w:rtl w:val="0"/>
+        </w:rPr>
+        <w:t xml:space="preserve"> is a full-stack luxury watch e-commerce platform that curates the world's most exceptional timepieces. It was designed to bring a private-boutique shopping experience online, combining an immersive 3D home experience, a concierge chat assistant, verified collector reviews, and a complete commerce workflow. While global platforms focus on wide-scale logistics, Lustro focuses on craftsmanship, curation, and personalized service for watch enthusiasts and collectors.</w:t>
       </w:r>
     </w:p>
     <w:p>
@@ -4924,9 +4927,9 @@
       </w:pPr>
       <w:r>
         <w:rPr>
-          <w:rFonts w:ascii="Times New Roman" w:hAnsi="Times New Roman" w:eastAsia="Times New Roman" w:cs="Times New Roman"/>
           <w:b/>
           <w:bCs/>
+          <w:rFonts w:ascii="Times New Roman" w:hAnsi="Times New Roman" w:eastAsia="Times New Roman" w:cs="Times New Roman"/>
           <w:i w:val="0"/>
           <w:iCs w:val="0"/>
           <w:smallCaps w:val="0"/>
@@ -4939,7 +4942,24 @@
           <w:vertAlign w:val="baseline"/>
           <w:rtl w:val="0"/>
         </w:rPr>
-        <w:t xml:space="preserve">Discovery Gap: Luxury timepieces are difficult to browse online; traditional stores offer limited photography, and generic retailers cannot convey rarity, provenance, or collector context.</w:t>
+        <w:t xml:space="preserve">Discovery Gap:</w:t>
+      </w:r>
+      <w:r>
+        <w:rPr>
+          <w:rFonts w:ascii="Times New Roman" w:hAnsi="Times New Roman" w:eastAsia="Times New Roman" w:cs="Times New Roman"/>
+          <w:i w:val="0"/>
+          <w:iCs w:val="0"/>
+          <w:smallCaps w:val="0"/>
+          <w:strike w:val="0"/>
+          <w:color w:val="000000"/>
+          <w:sz w:val="24"/>
+          <w:szCs w:val="24"/>
+          <w:u w:val="none"/>
+          <w:shd w:val="clear" w:color="auto" w:fill="auto"/>
+          <w:vertAlign w:val="baseline"/>
+          <w:rtl w:val="0"/>
+        </w:rPr>
+        <w:t xml:space="preserve">Luxury timepieces are difficult to browse online; traditional stores offer limited photography, and generic retailers cannot convey rarity, provenance, or collector context.</w:t>
       </w:r>
     </w:p>
     <w:p>
@@ -4981,9 +5001,9 @@
       </w:pPr>
       <w:r>
         <w:rPr>
-          <w:rFonts w:ascii="Times New Roman" w:hAnsi="Times New Roman" w:eastAsia="Times New Roman" w:cs="Times New Roman"/>
           <w:b/>
           <w:bCs/>
+          <w:rFonts w:ascii="Times New Roman" w:hAnsi="Times New Roman" w:eastAsia="Times New Roman" w:cs="Times New Roman"/>
           <w:i w:val="0"/>
           <w:iCs w:val="0"/>
           <w:smallCaps w:val="0"/>
@@ -4996,7 +5016,24 @@
           <w:vertAlign w:val="baseline"/>
           <w:rtl w:val="0"/>
         </w:rPr>
-        <w:t xml:space="preserve">Generic Browsing: Standard e-commerce platforms treat watches like commodity goods, with weak filtering and no specialist guidance for features such as movement type, caliber, power reserve, and water resistance.</w:t>
+        <w:t xml:space="preserve">Generic Browsing:</w:t>
+      </w:r>
+      <w:r>
+        <w:rPr>
+          <w:rFonts w:ascii="Times New Roman" w:hAnsi="Times New Roman" w:eastAsia="Times New Roman" w:cs="Times New Roman"/>
+          <w:i w:val="0"/>
+          <w:iCs w:val="0"/>
+          <w:smallCaps w:val="0"/>
+          <w:strike w:val="0"/>
+          <w:color w:val="000000"/>
+          <w:sz w:val="24"/>
+          <w:szCs w:val="24"/>
+          <w:u w:val="none"/>
+          <w:shd w:val="clear" w:color="auto" w:fill="auto"/>
+          <w:vertAlign w:val="baseline"/>
+          <w:rtl w:val="0"/>
+        </w:rPr>
+        <w:t xml:space="preserve">Standard e-commerce platforms treat watches like commodity goods, with weak filtering and no specialist guidance for features such as movement type, caliber, power reserve, and water resistance.</w:t>
       </w:r>
     </w:p>
     <w:p>
@@ -5038,9 +5075,9 @@
       </w:pPr>
       <w:r>
         <w:rPr>
-          <w:rFonts w:ascii="Times New Roman" w:hAnsi="Times New Roman" w:eastAsia="Times New Roman" w:cs="Times New Roman"/>
           <w:b/>
           <w:bCs/>
+          <w:rFonts w:ascii="Times New Roman" w:hAnsi="Times New Roman" w:eastAsia="Times New Roman" w:cs="Times New Roman"/>
           <w:i w:val="0"/>
           <w:iCs w:val="0"/>
           <w:smallCaps w:val="0"/>
@@ -5053,7 +5090,24 @@
           <w:vertAlign w:val="baseline"/>
           <w:rtl w:val="0"/>
         </w:rPr>
-        <w:t xml:space="preserve">Lack of Personalized Guidance: Shoppers often need expert advice matching a specific brand, budget, and style, which conventional recommendation engines fail to provide.</w:t>
+        <w:t xml:space="preserve">Lack of Personalized Guidance:</w:t>
+      </w:r>
+      <w:r>
+        <w:rPr>
+          <w:rFonts w:ascii="Times New Roman" w:hAnsi="Times New Roman" w:eastAsia="Times New Roman" w:cs="Times New Roman"/>
+          <w:i w:val="0"/>
+          <w:iCs w:val="0"/>
+          <w:smallCaps w:val="0"/>
+          <w:strike w:val="0"/>
+          <w:color w:val="000000"/>
+          <w:sz w:val="24"/>
+          <w:szCs w:val="24"/>
+          <w:u w:val="none"/>
+          <w:shd w:val="clear" w:color="auto" w:fill="auto"/>
+          <w:vertAlign w:val="baseline"/>
+          <w:rtl w:val="0"/>
+        </w:rPr>
+        <w:t xml:space="preserve">Shoppers often need expert advice matching a specific brand, budget, and style, which conventional recommendation engines fail to provide.</w:t>
       </w:r>
     </w:p>
     <w:p>
@@ -5941,9 +5995,9 @@
       </w:pPr>
       <w:r>
         <w:rPr>
-          <w:rFonts w:ascii="Times New Roman" w:hAnsi="Times New Roman" w:eastAsia="Times New Roman" w:cs="Times New Roman"/>
           <w:b/>
           <w:bCs/>
+          <w:rFonts w:ascii="Times New Roman" w:hAnsi="Times New Roman" w:eastAsia="Times New Roman" w:cs="Times New Roman"/>
           <w:i w:val="0"/>
           <w:iCs w:val="0"/>
           <w:smallCaps w:val="0"/>
@@ -5956,7 +6010,24 @@
           <w:vertAlign w:val="baseline"/>
           <w:rtl w:val="0"/>
         </w:rPr>
-        <w:t xml:space="preserve">Watch Model: The core catalogue entity storing titles, slugs, prices and discount prices, movement type, caliber, power reserve, case dimensions, materials, water resistance, stock levels, and featured flags such as 'is_featured' and 'is_trending'.</w:t>
+        <w:t xml:space="preserve">Watch Model:</w:t>
+      </w:r>
+      <w:r>
+        <w:rPr>
+          <w:rFonts w:ascii="Times New Roman" w:hAnsi="Times New Roman" w:eastAsia="Times New Roman" w:cs="Times New Roman"/>
+          <w:i w:val="0"/>
+          <w:iCs w:val="0"/>
+          <w:smallCaps w:val="0"/>
+          <w:strike w:val="0"/>
+          <w:color w:val="000000"/>
+          <w:sz w:val="24"/>
+          <w:szCs w:val="24"/>
+          <w:u w:val="none"/>
+          <w:shd w:val="clear" w:color="auto" w:fill="auto"/>
+          <w:vertAlign w:val="baseline"/>
+          <w:rtl w:val="0"/>
+        </w:rPr>
+        <w:t xml:space="preserve">The core catalogue entity storing titles, slugs, prices and discount prices, movement type, caliber, power reserve, case dimensions, materials, water resistance, stock levels, and featured flags such as 'is_featured' and 'is_trending'.</w:t>
       </w:r>
     </w:p>
     <w:p>
@@ -5998,9 +6069,9 @@
       </w:pPr>
       <w:r>
         <w:rPr>
-          <w:rFonts w:ascii="Times New Roman" w:hAnsi="Times New Roman" w:eastAsia="Times New Roman" w:cs="Times New Roman"/>
           <w:b/>
           <w:bCs/>
+          <w:rFonts w:ascii="Times New Roman" w:hAnsi="Times New Roman" w:eastAsia="Times New Roman" w:cs="Times New Roman"/>
           <w:i w:val="0"/>
           <w:iCs w:val="0"/>
           <w:smallCaps w:val="0"/>
@@ -6013,7 +6084,24 @@
           <w:vertAlign w:val="baseline"/>
           <w:rtl w:val="0"/>
         </w:rPr>
-        <w:t xml:space="preserve">Brand, Category and Collection Models: Allow structured organization of timepieces - essential for the filtering system used in the frontend - along with descriptions, logos, and cover images.</w:t>
+        <w:t xml:space="preserve">Brand, Category and Collection Models:</w:t>
+      </w:r>
+      <w:r>
+        <w:rPr>
+          <w:rFonts w:ascii="Times New Roman" w:hAnsi="Times New Roman" w:eastAsia="Times New Roman" w:cs="Times New Roman"/>
+          <w:i w:val="0"/>
+          <w:iCs w:val="0"/>
+          <w:smallCaps w:val="0"/>
+          <w:strike w:val="0"/>
+          <w:color w:val="000000"/>
+          <w:sz w:val="24"/>
+          <w:szCs w:val="24"/>
+          <w:u w:val="none"/>
+          <w:shd w:val="clear" w:color="auto" w:fill="auto"/>
+          <w:vertAlign w:val="baseline"/>
+          <w:rtl w:val="0"/>
+        </w:rPr>
+        <w:t xml:space="preserve">Allow structured organization of timepieces - essential for the filtering system used in the frontend - along with descriptions, logos, and cover images.</w:t>
       </w:r>
     </w:p>
     <w:p>
@@ -6055,9 +6143,9 @@
       </w:pPr>
       <w:r>
         <w:rPr>
-          <w:rFonts w:ascii="Times New Roman" w:hAnsi="Times New Roman" w:eastAsia="Times New Roman" w:cs="Times New Roman"/>
           <w:b/>
           <w:bCs/>
+          <w:rFonts w:ascii="Times New Roman" w:hAnsi="Times New Roman" w:eastAsia="Times New Roman" w:cs="Times New Roman"/>
           <w:i w:val="0"/>
           <w:iCs w:val="0"/>
           <w:smallCaps w:val="0"/>
@@ -6070,7 +6158,24 @@
           <w:vertAlign w:val="baseline"/>
           <w:rtl w:val="0"/>
         </w:rPr>
-        <w:t xml:space="preserve">Order, OrderItem and Coupon Models: Implement the full commerce flow including order numbers, payment methods (card or cash on delivery), payment status, shipping details, gift wrapping, discount tracking, and stock reservation and release on cancellation.</w:t>
+        <w:t xml:space="preserve">Order, OrderItem and Coupon Models:</w:t>
+      </w:r>
+      <w:r>
+        <w:rPr>
+          <w:rFonts w:ascii="Times New Roman" w:hAnsi="Times New Roman" w:eastAsia="Times New Roman" w:cs="Times New Roman"/>
+          <w:i w:val="0"/>
+          <w:iCs w:val="0"/>
+          <w:smallCaps w:val="0"/>
+          <w:strike w:val="0"/>
+          <w:color w:val="000000"/>
+          <w:sz w:val="24"/>
+          <w:szCs w:val="24"/>
+          <w:u w:val="none"/>
+          <w:shd w:val="clear" w:color="auto" w:fill="auto"/>
+          <w:vertAlign w:val="baseline"/>
+          <w:rtl w:val="0"/>
+        </w:rPr>
+        <w:t xml:space="preserve">Implement the full commerce flow including order numbers, payment methods (card or cash on delivery), payment status, shipping details, gift wrapping, discount tracking, and stock reservation and release on cancellation.</w:t>
       </w:r>
     </w:p>
     <w:p>
@@ -6112,9 +6217,9 @@
       </w:pPr>
       <w:r>
         <w:rPr>
-          <w:rFonts w:ascii="Times New Roman" w:hAnsi="Times New Roman" w:eastAsia="Times New Roman" w:cs="Times New Roman"/>
           <w:b/>
           <w:bCs/>
+          <w:rFonts w:ascii="Times New Roman" w:hAnsi="Times New Roman" w:eastAsia="Times New Roman" w:cs="Times New Roman"/>
           <w:i w:val="0"/>
           <w:iCs w:val="0"/>
           <w:smallCaps w:val="0"/>
@@ -6127,7 +6232,24 @@
           <w:vertAlign w:val="baseline"/>
           <w:rtl w:val="0"/>
         </w:rPr>
-        <w:t xml:space="preserve">Review Model: Implements a verified purchase system where users can leave ratings and text feedback to build community trust, alongside Conversation and Appointment models for the concierge chat and boutique bookings.</w:t>
+        <w:t xml:space="preserve">Review Model:</w:t>
+      </w:r>
+      <w:r>
+        <w:rPr>
+          <w:rFonts w:ascii="Times New Roman" w:hAnsi="Times New Roman" w:eastAsia="Times New Roman" w:cs="Times New Roman"/>
+          <w:i w:val="0"/>
+          <w:iCs w:val="0"/>
+          <w:smallCaps w:val="0"/>
+          <w:strike w:val="0"/>
+          <w:color w:val="000000"/>
+          <w:sz w:val="24"/>
+          <w:szCs w:val="24"/>
+          <w:u w:val="none"/>
+          <w:shd w:val="clear" w:color="auto" w:fill="auto"/>
+          <w:vertAlign w:val="baseline"/>
+          <w:rtl w:val="0"/>
+        </w:rPr>
+        <w:t xml:space="preserve">Implements a verified purchase system where users can leave ratings and text feedback to build community trust, alongside Conversation and Appointment models for the concierge chat and boutique bookings.</w:t>
       </w:r>
     </w:p>
     <w:p>
@@ -6889,8 +7011,6 @@
       <w:r>
         <w:rPr>
           <w:rFonts w:ascii="Times New Roman" w:hAnsi="Times New Roman" w:eastAsia="Times New Roman" w:cs="Times New Roman"/>
-          <w:b/>
-          <w:bCs/>
           <w:color w:val="000000"/>
           <w:sz w:val="24"/>
           <w:szCs w:val="24"/>
@@ -7921,7 +8041,21 @@
         <w:rPr>
           <w:rtl w:val="0"/>
         </w:rPr>
-        <w:t xml:space="preserve">Working on Lustro, I have mastered several key skills:</w:t>
+        <w:t xml:space="preserve">Working on </w:t>
+      </w:r>
+      <w:r>
+        <w:rPr>
+          <w:b/>
+          <w:bCs/>
+          <w:rtl w:val="0"/>
+        </w:rPr>
+        <w:t xml:space="preserve">Lustro</w:t>
+      </w:r>
+      <w:r>
+        <w:rPr>
+          <w:rtl w:val="0"/>
+        </w:rPr>
+        <w:t xml:space="preserve">, I have mastered several key skills:</w:t>
       </w:r>
     </w:p>
     <w:p>
@@ -7963,6 +8097,8 @@
       </w:pPr>
       <w:r>
         <w:rPr>
+          <w:b/>
+          <w:bCs/>
           <w:rFonts w:ascii="Times New Roman" w:hAnsi="Times New Roman" w:eastAsia="Times New Roman" w:cs="Times New Roman"/>
           <w:b w:val="0"/>
           <w:bCs w:val="0"/>
@@ -7978,7 +8114,26 @@
           <w:vertAlign w:val="baseline"/>
           <w:rtl w:val="0"/>
         </w:rPr>
-        <w:t xml:space="preserve">Full-stack Integration: Connecting a Django REST backend with a Vite-powered React frontend, including JWT authentication and TanStack Query data fetching.</w:t>
+        <w:t xml:space="preserve">Full-stack Integration:</w:t>
+      </w:r>
+      <w:r>
+        <w:rPr>
+          <w:rFonts w:ascii="Times New Roman" w:hAnsi="Times New Roman" w:eastAsia="Times New Roman" w:cs="Times New Roman"/>
+          <w:b w:val="0"/>
+          <w:bCs w:val="0"/>
+          <w:i w:val="0"/>
+          <w:iCs w:val="0"/>
+          <w:smallCaps w:val="0"/>
+          <w:strike w:val="0"/>
+          <w:color w:val="000000"/>
+          <w:sz w:val="24"/>
+          <w:szCs w:val="24"/>
+          <w:u w:val="none"/>
+          <w:shd w:val="clear" w:color="auto" w:fill="auto"/>
+          <w:vertAlign w:val="baseline"/>
+          <w:rtl w:val="0"/>
+        </w:rPr>
+        <w:t xml:space="preserve">Connecting a Django REST backend with a Vite-powered React frontend, including JWT authentication and TanStack Query data fetching.</w:t>
       </w:r>
     </w:p>
     <w:p>
@@ -8020,6 +8175,8 @@
       </w:pPr>
       <w:r>
         <w:rPr>
+          <w:b/>
+          <w:bCs/>
           <w:rFonts w:ascii="Times New Roman" w:hAnsi="Times New Roman" w:eastAsia="Times New Roman" w:cs="Times New Roman"/>
           <w:b w:val="0"/>
           <w:bCs w:val="0"/>
@@ -8035,7 +8192,26 @@
           <w:vertAlign w:val="baseline"/>
           <w:rtl w:val="0"/>
         </w:rPr>
-        <w:t xml:space="preserve">Advanced Styling and Animation: Using Tailwind CSS for responsive, theme-aware interfaces plus three.js, GSAP, and Framer Motion for motion design.</w:t>
+        <w:t xml:space="preserve">Advanced Styling and Animation:</w:t>
+      </w:r>
+      <w:r>
+        <w:rPr>
+          <w:rFonts w:ascii="Times New Roman" w:hAnsi="Times New Roman" w:eastAsia="Times New Roman" w:cs="Times New Roman"/>
+          <w:b w:val="0"/>
+          <w:bCs w:val="0"/>
+          <w:i w:val="0"/>
+          <w:iCs w:val="0"/>
+          <w:smallCaps w:val="0"/>
+          <w:strike w:val="0"/>
+          <w:color w:val="000000"/>
+          <w:sz w:val="24"/>
+          <w:szCs w:val="24"/>
+          <w:u w:val="none"/>
+          <w:shd w:val="clear" w:color="auto" w:fill="auto"/>
+          <w:vertAlign w:val="baseline"/>
+          <w:rtl w:val="0"/>
+        </w:rPr>
+        <w:t xml:space="preserve">Using Tailwind CSS for responsive, theme-aware interfaces plus three.js, GSAP, and Framer Motion for motion design.</w:t>
       </w:r>
     </w:p>
     <w:p>
@@ -8077,6 +8253,8 @@
       </w:pPr>
       <w:r>
         <w:rPr>
+          <w:b/>
+          <w:bCs/>
           <w:rFonts w:ascii="Times New Roman" w:hAnsi="Times New Roman" w:eastAsia="Times New Roman" w:cs="Times New Roman"/>
           <w:b w:val="0"/>
           <w:bCs w:val="0"/>
@@ -8092,7 +8270,26 @@
           <w:vertAlign w:val="baseline"/>
           <w:rtl w:val="0"/>
         </w:rPr>
-        <w:t xml:space="preserve">Commerce Logic: Designing multi-step checkout, coupon and stock-reservation flows with database transactions.</w:t>
+        <w:t xml:space="preserve">Commerce Logic:</w:t>
+      </w:r>
+      <w:r>
+        <w:rPr>
+          <w:rFonts w:ascii="Times New Roman" w:hAnsi="Times New Roman" w:eastAsia="Times New Roman" w:cs="Times New Roman"/>
+          <w:b w:val="0"/>
+          <w:bCs w:val="0"/>
+          <w:i w:val="0"/>
+          <w:iCs w:val="0"/>
+          <w:smallCaps w:val="0"/>
+          <w:strike w:val="0"/>
+          <w:color w:val="000000"/>
+          <w:sz w:val="24"/>
+          <w:szCs w:val="24"/>
+          <w:u w:val="none"/>
+          <w:shd w:val="clear" w:color="auto" w:fill="auto"/>
+          <w:vertAlign w:val="baseline"/>
+          <w:rtl w:val="0"/>
+        </w:rPr>
+        <w:t xml:space="preserve">Designing multi-step checkout, coupon and stock-reservation flows with database transactions.</w:t>
       </w:r>
     </w:p>
     <w:p>
@@ -8134,9 +8331,9 @@
       </w:pPr>
       <w:r>
         <w:rPr>
-          <w:rFonts w:ascii="Times New Roman" w:hAnsi="Times New Roman" w:eastAsia="Times New Roman" w:cs="Times New Roman"/>
           <w:b/>
           <w:bCs/>
+          <w:rFonts w:ascii="Times New Roman" w:hAnsi="Times New Roman" w:eastAsia="Times New Roman" w:cs="Times New Roman"/>
           <w:i w:val="0"/>
           <w:iCs w:val="0"/>
           <w:smallCaps w:val="0"/>
@@ -8149,7 +8346,24 @@
           <w:vertAlign w:val="baseline"/>
           <w:rtl w:val="0"/>
         </w:rPr>
-        <w:t xml:space="preserve">Version Control: Maintaining a clean development history and managing different features via Git.</w:t>
+        <w:t xml:space="preserve">Version Control:</w:t>
+      </w:r>
+      <w:r>
+        <w:rPr>
+          <w:rFonts w:ascii="Times New Roman" w:hAnsi="Times New Roman" w:eastAsia="Times New Roman" w:cs="Times New Roman"/>
+          <w:i w:val="0"/>
+          <w:iCs w:val="0"/>
+          <w:smallCaps w:val="0"/>
+          <w:strike w:val="0"/>
+          <w:color w:val="000000"/>
+          <w:sz w:val="24"/>
+          <w:szCs w:val="24"/>
+          <w:u w:val="none"/>
+          <w:shd w:val="clear" w:color="auto" w:fill="auto"/>
+          <w:vertAlign w:val="baseline"/>
+          <w:rtl w:val="0"/>
+        </w:rPr>
+        <w:t xml:space="preserve">Maintaining a clean development history and managing different features via Git.</w:t>
       </w:r>
     </w:p>
     <w:p>
@@ -8303,9 +8517,9 @@
       </w:pPr>
       <w:r>
         <w:rPr>
-          <w:rFonts w:ascii="Times New Roman" w:hAnsi="Times New Roman" w:eastAsia="Times New Roman" w:cs="Times New Roman"/>
           <w:b/>
           <w:bCs/>
+          <w:rFonts w:ascii="Times New Roman" w:hAnsi="Times New Roman" w:eastAsia="Times New Roman" w:cs="Times New Roman"/>
           <w:i w:val="0"/>
           <w:iCs w:val="0"/>
           <w:smallCaps w:val="0"/>
@@ -8318,7 +8532,24 @@
           <w:vertAlign w:val="baseline"/>
           <w:rtl w:val="0"/>
         </w:rPr>
-        <w:t xml:space="preserve">Prototype Scope: The project was limited to a functional prototype; full production deployment with real payment gateway integration was not achieved within the OJT period.</w:t>
+        <w:t xml:space="preserve">Prototype Scope:</w:t>
+      </w:r>
+      <w:r>
+        <w:rPr>
+          <w:rFonts w:ascii="Times New Roman" w:hAnsi="Times New Roman" w:eastAsia="Times New Roman" w:cs="Times New Roman"/>
+          <w:i w:val="0"/>
+          <w:iCs w:val="0"/>
+          <w:smallCaps w:val="0"/>
+          <w:strike w:val="0"/>
+          <w:color w:val="000000"/>
+          <w:sz w:val="24"/>
+          <w:szCs w:val="24"/>
+          <w:u w:val="none"/>
+          <w:shd w:val="clear" w:color="auto" w:fill="auto"/>
+          <w:vertAlign w:val="baseline"/>
+          <w:rtl w:val="0"/>
+        </w:rPr>
+        <w:t xml:space="preserve">The project was limited to a functional prototype; full production deployment with real payment gateway integration was not achieved within the OJT period.</w:t>
       </w:r>
     </w:p>
     <w:p>
@@ -8360,9 +8591,9 @@
       </w:pPr>
       <w:r>
         <w:rPr>
-          <w:rFonts w:ascii="Times New Roman" w:hAnsi="Times New Roman" w:eastAsia="Times New Roman" w:cs="Times New Roman"/>
           <w:b/>
           <w:bCs/>
+          <w:rFonts w:ascii="Times New Roman" w:hAnsi="Times New Roman" w:eastAsia="Times New Roman" w:cs="Times New Roman"/>
           <w:i w:val="0"/>
           <w:iCs w:val="0"/>
           <w:smallCaps w:val="0"/>
@@ -8375,7 +8606,24 @@
           <w:vertAlign w:val="baseline"/>
           <w:rtl w:val="0"/>
         </w:rPr>
-        <w:t xml:space="preserve">Connectivity Issues: Intermittent internet connectivity at school occasionally disrupted live API testing and deployment workflows.</w:t>
+        <w:t xml:space="preserve">Connectivity Issues:</w:t>
+      </w:r>
+      <w:r>
+        <w:rPr>
+          <w:rFonts w:ascii="Times New Roman" w:hAnsi="Times New Roman" w:eastAsia="Times New Roman" w:cs="Times New Roman"/>
+          <w:i w:val="0"/>
+          <w:iCs w:val="0"/>
+          <w:smallCaps w:val="0"/>
+          <w:strike w:val="0"/>
+          <w:color w:val="000000"/>
+          <w:sz w:val="24"/>
+          <w:szCs w:val="24"/>
+          <w:u w:val="none"/>
+          <w:shd w:val="clear" w:color="auto" w:fill="auto"/>
+          <w:vertAlign w:val="baseline"/>
+          <w:rtl w:val="0"/>
+        </w:rPr>
+        <w:t xml:space="preserve">Intermittent internet connectivity at school occasionally disrupted live API testing and deployment workflows.</w:t>
       </w:r>
     </w:p>
     <w:p>
@@ -8417,9 +8665,9 @@
       </w:pPr>
       <w:r>
         <w:rPr>
-          <w:rFonts w:ascii="Times New Roman" w:hAnsi="Times New Roman" w:eastAsia="Times New Roman" w:cs="Times New Roman"/>
           <w:b/>
           <w:bCs/>
+          <w:rFonts w:ascii="Times New Roman" w:hAnsi="Times New Roman" w:eastAsia="Times New Roman" w:cs="Times New Roman"/>
           <w:i w:val="0"/>
           <w:iCs w:val="0"/>
           <w:smallCaps w:val="0"/>
@@ -8432,7 +8680,24 @@
           <w:vertAlign w:val="baseline"/>
           <w:rtl w:val="0"/>
         </w:rPr>
-        <w:t xml:space="preserve">Time Constraints: Limited OJT duration prevented deeper exploration of advanced performance optimization, image optimization pipelines, and more extensive test coverage.</w:t>
+        <w:t xml:space="preserve">Time Constraints:</w:t>
+      </w:r>
+      <w:r>
+        <w:rPr>
+          <w:rFonts w:ascii="Times New Roman" w:hAnsi="Times New Roman" w:eastAsia="Times New Roman" w:cs="Times New Roman"/>
+          <w:i w:val="0"/>
+          <w:iCs w:val="0"/>
+          <w:smallCaps w:val="0"/>
+          <w:strike w:val="0"/>
+          <w:color w:val="000000"/>
+          <w:sz w:val="24"/>
+          <w:szCs w:val="24"/>
+          <w:u w:val="none"/>
+          <w:shd w:val="clear" w:color="auto" w:fill="auto"/>
+          <w:vertAlign w:val="baseline"/>
+          <w:rtl w:val="0"/>
+        </w:rPr>
+        <w:t xml:space="preserve">Limited OJT duration prevented deeper exploration of advanced performance optimization, image optimization pipelines, and more extensive test coverage.</w:t>
       </w:r>
     </w:p>
     <w:p>
@@ -8507,15 +8772,25 @@
       </w:pPr>
       <w:r>
         <w:rPr>
-          <w:rFonts w:ascii="Times New Roman" w:hAnsi="Times New Roman" w:eastAsia="Times New Roman" w:cs="Times New Roman"/>
           <w:b/>
           <w:bCs/>
+          <w:rFonts w:ascii="Times New Roman" w:hAnsi="Times New Roman" w:eastAsia="Times New Roman" w:cs="Times New Roman"/>
           <w:color w:val="000000"/>
           <w:sz w:val="24"/>
           <w:szCs w:val="24"/>
           <w:rtl w:val="0"/>
         </w:rPr>
-        <w:t xml:space="preserve">Real-time Notifications: Integrating WebSockets to notify customers and administrators of order status changes instantly.</w:t>
+        <w:t xml:space="preserve">Real-time Notifications:</w:t>
+      </w:r>
+      <w:r>
+        <w:rPr>
+          <w:rFonts w:ascii="Times New Roman" w:hAnsi="Times New Roman" w:eastAsia="Times New Roman" w:cs="Times New Roman"/>
+          <w:color w:val="000000"/>
+          <w:sz w:val="24"/>
+          <w:szCs w:val="24"/>
+          <w:rtl w:val="0"/>
+        </w:rPr>
+        <w:t xml:space="preserve">Integrating WebSockets to notify customers and administrators of order status changes instantly.</w:t>
       </w:r>
     </w:p>
     <w:p>
@@ -8538,15 +8813,25 @@
       </w:pPr>
       <w:r>
         <w:rPr>
-          <w:rFonts w:ascii="Times New Roman" w:hAnsi="Times New Roman" w:eastAsia="Times New Roman" w:cs="Times New Roman"/>
           <w:b/>
           <w:bCs/>
+          <w:rFonts w:ascii="Times New Roman" w:hAnsi="Times New Roman" w:eastAsia="Times New Roman" w:cs="Times New Roman"/>
           <w:color w:val="000000"/>
           <w:sz w:val="24"/>
           <w:szCs w:val="24"/>
           <w:rtl w:val="0"/>
         </w:rPr>
-        <w:t xml:space="preserve">Payment Integration: Connecting real payment gateways for card payments, alongside shipping-tracking APIs.</w:t>
+        <w:t xml:space="preserve">Payment Integration:</w:t>
+      </w:r>
+      <w:r>
+        <w:rPr>
+          <w:rFonts w:ascii="Times New Roman" w:hAnsi="Times New Roman" w:eastAsia="Times New Roman" w:cs="Times New Roman"/>
+          <w:color w:val="000000"/>
+          <w:sz w:val="24"/>
+          <w:szCs w:val="24"/>
+          <w:rtl w:val="0"/>
+        </w:rPr>
+        <w:t xml:space="preserve">Connecting real payment gateways for card payments, alongside shipping-tracking APIs.</w:t>
       </w:r>
     </w:p>
     <w:p>
@@ -8569,15 +8854,25 @@
       </w:pPr>
       <w:r>
         <w:rPr>
-          <w:rFonts w:ascii="Times New Roman" w:hAnsi="Times New Roman" w:eastAsia="Times New Roman" w:cs="Times New Roman"/>
           <w:b/>
           <w:bCs/>
+          <w:rFonts w:ascii="Times New Roman" w:hAnsi="Times New Roman" w:eastAsia="Times New Roman" w:cs="Times New Roman"/>
           <w:color w:val="000000"/>
           <w:sz w:val="24"/>
           <w:szCs w:val="24"/>
           <w:rtl w:val="0"/>
         </w:rPr>
-        <w:t xml:space="preserve">Enhanced Concierge AI: Extending the rule-based engine with a large language model trained on the catalogue to provide even more conversational and accurate recommendations.</w:t>
+        <w:t xml:space="preserve">Enhanced Concierge AI:</w:t>
+      </w:r>
+      <w:r>
+        <w:rPr>
+          <w:rFonts w:ascii="Times New Roman" w:hAnsi="Times New Roman" w:eastAsia="Times New Roman" w:cs="Times New Roman"/>
+          <w:color w:val="000000"/>
+          <w:sz w:val="24"/>
+          <w:szCs w:val="24"/>
+          <w:rtl w:val="0"/>
+        </w:rPr>
+        <w:t xml:space="preserve">Extending the rule-based engine with a large language model trained on the catalogue to provide even more conversational and accurate recommendations.</w:t>
       </w:r>
     </w:p>
     <w:p>
@@ -9000,7 +9295,21 @@
         <w:rPr>
           <w:rtl w:val="0"/>
         </w:rPr>
-        <w:t xml:space="preserve">1.  Django REST Framework (Backend API): https://www.django-rest-framework.org/</w:t>
+        <w:t xml:space="preserve">1.  </w:t>
+      </w:r>
+      <w:r>
+        <w:rPr>
+          <w:b/>
+          <w:bCs/>
+          <w:rtl w:val="0"/>
+        </w:rPr>
+        <w:t xml:space="preserve">Django REST Framework</w:t>
+      </w:r>
+      <w:r>
+        <w:rPr>
+          <w:rtl w:val="0"/>
+        </w:rPr>
+        <w:t xml:space="preserve"> (Backend API): https://www.django-rest-framework.org/</w:t>
       </w:r>
     </w:p>
     <w:p>
@@ -9014,7 +9323,21 @@
         <w:rPr>
           <w:rtl w:val="0"/>
         </w:rPr>
-        <w:t xml:space="preserve">2.  React (Frontend Library): https://react.dev</w:t>
+        <w:t xml:space="preserve">2.  </w:t>
+      </w:r>
+      <w:r>
+        <w:rPr>
+          <w:b/>
+          <w:bCs/>
+          <w:rtl w:val="0"/>
+        </w:rPr>
+        <w:t xml:space="preserve">React + Vite</w:t>
+      </w:r>
+      <w:r>
+        <w:rPr>
+          <w:rtl w:val="0"/>
+        </w:rPr>
+        <w:t xml:space="preserve"> (Frontend): https://react.dev</w:t>
       </w:r>
     </w:p>
     <w:p>
@@ -9028,7 +9351,21 @@
         <w:rPr>
           <w:rtl w:val="0"/>
         </w:rPr>
-        <w:t xml:space="preserve">3.  Three.js (3D Graphics): https://threejs.org</w:t>
+        <w:t xml:space="preserve">3.  </w:t>
+      </w:r>
+      <w:r>
+        <w:rPr>
+          <w:b/>
+          <w:bCs/>
+          <w:rtl w:val="0"/>
+        </w:rPr>
+        <w:t xml:space="preserve">Three.js</w:t>
+      </w:r>
+      <w:r>
+        <w:rPr>
+          <w:rtl w:val="0"/>
+        </w:rPr>
+        <w:t xml:space="preserve"> (3D Graphics): https://threejs.org</w:t>
       </w:r>
     </w:p>
     <w:p>
@@ -9038,8 +9375,15 @@
         <w:ind/>
         <w:rPr/>
       </w:pPr>
-      <w:r/>
-      <w:r/>
+      <w:r>
+        <w:t xml:space="preserve">4.  </w:t>
+      </w:r>
+      <w:r>
+        <w:t xml:space="preserve">Tailwind CSS</w:t>
+      </w:r>
+      <w:r>
+        <w:t xml:space="preserve"> (Styling): https://tailwindcss.com</w:t>
+      </w:r>
     </w:p>
     <w:sectPr>
       <w:headerReference w:type="default" r:id="rId11"/>

</xml_diff>

<commit_message>
Update report: replace placeholder screenshots with real images, convert abbreviations to table
- image4: Advanced Filtering & Sorting (shop page with filters)
- image5: Instant Full-Text Search (search modal with Rolex query)
- image6: Lustro Concierge (chat widget open)
- image9: Multi-Step Checkout (cart page)
- image10: Collector Reviews (product detail with reviews)
- Abbreviations section: converted from inline colon format to proper 2-column table
</commit_message>
<xml_diff>
--- a/report/Lustro-Report by Ashwin Sunuwar.docx
+++ b/report/Lustro-Report by Ashwin Sunuwar.docx
@@ -4485,258 +4485,306 @@
         </w:rPr>
       </w:r>
     </w:p>
-    <w:p>
-      <w:pPr>
-        <w:pBdr/>
-        <w:spacing w:after="60" w:before="60" w:line="480" w:lineRule="auto"/>
-        <w:ind w:hanging="720" w:left="720"/>
-        <w:rPr/>
-      </w:pPr>
-      <w:r>
-        <w:rPr>
-          <w:b/>
-          <w:bCs/>
-          <w:rFonts w:ascii="Times New Roman" w:hAnsi="Times New Roman" w:eastAsia="Times New Roman" w:cs="Times New Roman"/>
-          <w:sz w:val="24"/>
-          <w:szCs w:val="24"/>
-          <w:rtl w:val="0"/>
-        </w:rPr>
-        <w:t xml:space="preserve">OJT</w:t>
-      </w:r>
-      <w:r>
-        <w:rPr>
-          <w:rFonts w:ascii="Times New Roman" w:hAnsi="Times New Roman" w:eastAsia="Times New Roman" w:cs="Times New Roman"/>
-          <w:sz w:val="24"/>
-          <w:szCs w:val="24"/>
-          <w:rtl w:val="0"/>
-        </w:rPr>
-        <w:t xml:space="preserve"> :  On-the-Job Training</w:t>
-      </w:r>
-    </w:p>
-    <w:p>
-      <w:pPr>
-        <w:pBdr/>
-        <w:spacing w:after="60" w:before="60" w:line="480" w:lineRule="auto"/>
-        <w:ind w:hanging="720" w:left="720"/>
-        <w:rPr/>
-      </w:pPr>
-      <w:r>
-        <w:rPr>
-          <w:b/>
-          <w:bCs/>
-          <w:rFonts w:ascii="Times New Roman" w:hAnsi="Times New Roman" w:eastAsia="Times New Roman" w:cs="Times New Roman"/>
-          <w:sz w:val="24"/>
-          <w:szCs w:val="24"/>
-          <w:rtl w:val="0"/>
-        </w:rPr>
-        <w:t xml:space="preserve">API</w:t>
-      </w:r>
-      <w:r>
-        <w:rPr>
-          <w:rFonts w:ascii="Times New Roman" w:hAnsi="Times New Roman" w:eastAsia="Times New Roman" w:cs="Times New Roman"/>
-          <w:sz w:val="24"/>
-          <w:szCs w:val="24"/>
-          <w:rtl w:val="0"/>
-        </w:rPr>
-        <w:t xml:space="preserve"> :  Application Programming Interface</w:t>
-      </w:r>
-    </w:p>
-    <w:p>
-      <w:pPr>
-        <w:pBdr/>
-        <w:spacing w:after="60" w:before="60" w:line="480" w:lineRule="auto"/>
-        <w:ind w:hanging="720" w:left="720"/>
-        <w:rPr/>
-      </w:pPr>
-      <w:r>
-        <w:rPr>
-          <w:b/>
-          <w:bCs/>
-          <w:rFonts w:ascii="Times New Roman" w:hAnsi="Times New Roman" w:eastAsia="Times New Roman" w:cs="Times New Roman"/>
-          <w:sz w:val="24"/>
-          <w:szCs w:val="24"/>
-          <w:rtl w:val="0"/>
-        </w:rPr>
-        <w:t xml:space="preserve">JWT</w:t>
-      </w:r>
-      <w:r>
-        <w:rPr>
-          <w:rFonts w:ascii="Times New Roman" w:hAnsi="Times New Roman" w:eastAsia="Times New Roman" w:cs="Times New Roman"/>
-          <w:sz w:val="24"/>
-          <w:szCs w:val="24"/>
-          <w:rtl w:val="0"/>
-        </w:rPr>
-        <w:t xml:space="preserve"> :  JSON Web Token</w:t>
-      </w:r>
-    </w:p>
-    <w:p>
-      <w:pPr>
-        <w:pBdr/>
-        <w:spacing w:after="60" w:before="60" w:line="480" w:lineRule="auto"/>
-        <w:ind w:hanging="720" w:left="720"/>
-        <w:rPr/>
-      </w:pPr>
-      <w:r>
-        <w:rPr>
-          <w:b/>
-          <w:bCs/>
-          <w:rFonts w:ascii="Times New Roman" w:hAnsi="Times New Roman" w:eastAsia="Times New Roman" w:cs="Times New Roman"/>
-          <w:sz w:val="24"/>
-          <w:szCs w:val="24"/>
-          <w:rtl w:val="0"/>
-        </w:rPr>
-        <w:t xml:space="preserve">SPA</w:t>
-      </w:r>
-      <w:r>
-        <w:rPr>
-          <w:rFonts w:ascii="Times New Roman" w:hAnsi="Times New Roman" w:eastAsia="Times New Roman" w:cs="Times New Roman"/>
-          <w:sz w:val="24"/>
-          <w:szCs w:val="24"/>
-          <w:rtl w:val="0"/>
-        </w:rPr>
-        <w:t xml:space="preserve"> :  Single Page Application</w:t>
-      </w:r>
-    </w:p>
-    <w:p>
-      <w:pPr>
-        <w:pBdr/>
-        <w:spacing w:after="60" w:before="60" w:line="480" w:lineRule="auto"/>
-        <w:ind w:hanging="720" w:left="720"/>
-        <w:rPr/>
-      </w:pPr>
-      <w:r>
-        <w:rPr>
-          <w:b/>
-          <w:bCs/>
-          <w:rFonts w:ascii="Times New Roman" w:hAnsi="Times New Roman" w:eastAsia="Times New Roman" w:cs="Times New Roman"/>
-          <w:sz w:val="24"/>
-          <w:szCs w:val="24"/>
-          <w:rtl w:val="0"/>
-        </w:rPr>
-        <w:t xml:space="preserve">DRF</w:t>
-      </w:r>
-      <w:r>
-        <w:rPr>
-          <w:rFonts w:ascii="Times New Roman" w:hAnsi="Times New Roman" w:eastAsia="Times New Roman" w:cs="Times New Roman"/>
-          <w:sz w:val="24"/>
-          <w:szCs w:val="24"/>
-          <w:rtl w:val="0"/>
-        </w:rPr>
-        <w:t xml:space="preserve"> :  Django REST Framework</w:t>
-      </w:r>
-    </w:p>
-    <w:p>
-      <w:pPr>
-        <w:pBdr/>
-        <w:spacing w:after="60" w:before="60" w:line="480" w:lineRule="auto"/>
-        <w:ind w:hanging="720" w:left="720"/>
-        <w:rPr/>
-      </w:pPr>
-      <w:r>
-        <w:rPr>
-          <w:b/>
-          <w:bCs/>
-          <w:rFonts w:ascii="Times New Roman" w:hAnsi="Times New Roman" w:eastAsia="Times New Roman" w:cs="Times New Roman"/>
-          <w:sz w:val="24"/>
-          <w:szCs w:val="24"/>
-          <w:rtl w:val="0"/>
-        </w:rPr>
-        <w:t xml:space="preserve">ORM</w:t>
-      </w:r>
-      <w:r>
-        <w:rPr>
-          <w:rFonts w:ascii="Times New Roman" w:hAnsi="Times New Roman" w:eastAsia="Times New Roman" w:cs="Times New Roman"/>
-          <w:sz w:val="24"/>
-          <w:szCs w:val="24"/>
-          <w:rtl w:val="0"/>
-        </w:rPr>
-        <w:t xml:space="preserve"> :  Object-Relational Mapping</w:t>
-      </w:r>
-    </w:p>
-    <w:p>
-      <w:pPr>
-        <w:pBdr/>
-        <w:spacing w:after="60" w:before="60" w:line="480" w:lineRule="auto"/>
-        <w:ind w:hanging="720" w:left="720"/>
-        <w:rPr/>
-      </w:pPr>
-      <w:r>
-        <w:rPr>
-          <w:b/>
-          <w:bCs/>
-          <w:rFonts w:ascii="Times New Roman" w:hAnsi="Times New Roman" w:eastAsia="Times New Roman" w:cs="Times New Roman"/>
-          <w:sz w:val="24"/>
-          <w:szCs w:val="24"/>
-          <w:rtl w:val="0"/>
-        </w:rPr>
-        <w:t xml:space="preserve">3D</w:t>
-      </w:r>
-      <w:r>
-        <w:rPr>
-          <w:rFonts w:ascii="Times New Roman" w:hAnsi="Times New Roman" w:eastAsia="Times New Roman" w:cs="Times New Roman"/>
-          <w:sz w:val="24"/>
-          <w:szCs w:val="24"/>
-          <w:rtl w:val="0"/>
-        </w:rPr>
-        <w:t xml:space="preserve"> :  Three-Dimensional Rendering (three.js)</w:t>
-      </w:r>
-    </w:p>
-    <w:p>
-      <w:pPr>
-        <w:pBdr/>
-        <w:spacing w:after="60" w:before="60" w:line="480" w:lineRule="auto"/>
-        <w:ind w:hanging="720" w:left="720"/>
-        <w:rPr/>
-      </w:pPr>
-      <w:r>
-        <w:rPr>
-          <w:b/>
-          <w:bCs/>
-          <w:rFonts w:ascii="Times New Roman" w:hAnsi="Times New Roman" w:eastAsia="Times New Roman" w:cs="Times New Roman"/>
-          <w:sz w:val="24"/>
-          <w:szCs w:val="24"/>
-          <w:rtl w:val="0"/>
-        </w:rPr>
-        <w:t xml:space="preserve">SEO</w:t>
-      </w:r>
-      <w:r>
-        <w:rPr>
-          <w:rFonts w:ascii="Times New Roman" w:hAnsi="Times New Roman" w:eastAsia="Times New Roman" w:cs="Times New Roman"/>
-          <w:sz w:val="24"/>
-          <w:szCs w:val="24"/>
-          <w:rtl w:val="0"/>
-        </w:rPr>
-        <w:t xml:space="preserve"> :  Search Engine Optimization</w:t>
-      </w:r>
-    </w:p>
-    <w:p>
-      <w:pPr>
-        <w:pBdr/>
-        <w:spacing w:after="60" w:before="60" w:line="480" w:lineRule="auto"/>
-        <w:ind w:hanging="720" w:left="720"/>
-        <w:rPr/>
-      </w:pPr>
-      <w:r>
-        <w:rPr>
-          <w:b/>
-          <w:bCs/>
-          <w:rFonts w:ascii="Times New Roman" w:hAnsi="Times New Roman" w:eastAsia="Times New Roman" w:cs="Times New Roman"/>
-          <w:sz w:val="24"/>
-          <w:szCs w:val="24"/>
-          <w:rtl w:val="0"/>
-        </w:rPr>
-        <w:t xml:space="preserve">COD</w:t>
-      </w:r>
-      <w:r>
-        <w:rPr>
-          <w:rFonts w:ascii="Times New Roman" w:hAnsi="Times New Roman" w:eastAsia="Times New Roman" w:cs="Times New Roman"/>
-          <w:sz w:val="24"/>
-          <w:szCs w:val="24"/>
-          <w:rtl w:val="0"/>
-        </w:rPr>
-        <w:t xml:space="preserve"> :  Cash on Delivery</w:t>
-      </w:r>
-    </w:p>
+    <w:tbl>
+      <w:tblPr>
+        <w:tblStyle w:val="754"/>
+        <w:tblW w:type="auto" w:w="0"/>
+        <w:jc w:val="center"/>
+        <w:tblLook w:firstColumn="1" w:firstRow="1" w:lastColumn="0" w:lastRow="0" w:noHBand="0" w:noVBand="1" w:val="04A0"/>
+      </w:tblPr>
+      <w:tblGrid>
+        <w:gridCol w:w="4680"/>
+        <w:gridCol w:w="4680"/>
+      </w:tblGrid>
+      <w:tr>
+        <w:tc>
+          <w:tcPr>
+            <w:tcW w:type="dxa" w:w="1701"/>
+          </w:tcPr>
+          <w:p>
+            <w:pPr>
+              <w:jc w:val="center"/>
+            </w:pPr>
+            <w:r>
+              <w:rPr>
+                <w:b/>
+                <w:sz w:val="20"/>
+              </w:rPr>
+              <w:t>Abbreviation</w:t>
+            </w:r>
+          </w:p>
+        </w:tc>
+        <w:tc>
+          <w:tcPr>
+            <w:tcW w:type="dxa" w:w="6803"/>
+          </w:tcPr>
+          <w:p>
+            <w:pPr>
+              <w:jc w:val="center"/>
+            </w:pPr>
+            <w:r>
+              <w:rPr>
+                <w:b/>
+                <w:sz w:val="20"/>
+              </w:rPr>
+              <w:t>Full Form</w:t>
+            </w:r>
+          </w:p>
+        </w:tc>
+      </w:tr>
+      <w:tr>
+        <w:tc>
+          <w:tcPr>
+            <w:tcW w:type="dxa" w:w="4680"/>
+          </w:tcPr>
+          <w:p>
+            <w:r>
+              <w:rPr>
+                <w:sz w:val="20"/>
+              </w:rPr>
+              <w:t>OJT</w:t>
+            </w:r>
+          </w:p>
+        </w:tc>
+        <w:tc>
+          <w:tcPr>
+            <w:tcW w:type="dxa" w:w="4680"/>
+          </w:tcPr>
+          <w:p>
+            <w:r>
+              <w:rPr>
+                <w:sz w:val="20"/>
+              </w:rPr>
+              <w:t>On-the-Job Training</w:t>
+            </w:r>
+          </w:p>
+        </w:tc>
+      </w:tr>
+      <w:tr>
+        <w:tc>
+          <w:tcPr>
+            <w:tcW w:type="dxa" w:w="4680"/>
+          </w:tcPr>
+          <w:p>
+            <w:r>
+              <w:rPr>
+                <w:sz w:val="20"/>
+              </w:rPr>
+              <w:t>API</w:t>
+            </w:r>
+          </w:p>
+        </w:tc>
+        <w:tc>
+          <w:tcPr>
+            <w:tcW w:type="dxa" w:w="4680"/>
+          </w:tcPr>
+          <w:p>
+            <w:r>
+              <w:rPr>
+                <w:sz w:val="20"/>
+              </w:rPr>
+              <w:t>Application Programming Interface</w:t>
+            </w:r>
+          </w:p>
+        </w:tc>
+      </w:tr>
+      <w:tr>
+        <w:tc>
+          <w:tcPr>
+            <w:tcW w:type="dxa" w:w="4680"/>
+          </w:tcPr>
+          <w:p>
+            <w:r>
+              <w:rPr>
+                <w:sz w:val="20"/>
+              </w:rPr>
+              <w:t>JWT</w:t>
+            </w:r>
+          </w:p>
+        </w:tc>
+        <w:tc>
+          <w:tcPr>
+            <w:tcW w:type="dxa" w:w="4680"/>
+          </w:tcPr>
+          <w:p>
+            <w:r>
+              <w:rPr>
+                <w:sz w:val="20"/>
+              </w:rPr>
+              <w:t>JSON Web Token</w:t>
+            </w:r>
+          </w:p>
+        </w:tc>
+      </w:tr>
+      <w:tr>
+        <w:tc>
+          <w:tcPr>
+            <w:tcW w:type="dxa" w:w="4680"/>
+          </w:tcPr>
+          <w:p>
+            <w:r>
+              <w:rPr>
+                <w:sz w:val="20"/>
+              </w:rPr>
+              <w:t>SPA</w:t>
+            </w:r>
+          </w:p>
+        </w:tc>
+        <w:tc>
+          <w:tcPr>
+            <w:tcW w:type="dxa" w:w="4680"/>
+          </w:tcPr>
+          <w:p>
+            <w:r>
+              <w:rPr>
+                <w:sz w:val="20"/>
+              </w:rPr>
+              <w:t>Single Page Application</w:t>
+            </w:r>
+          </w:p>
+        </w:tc>
+      </w:tr>
+      <w:tr>
+        <w:tc>
+          <w:tcPr>
+            <w:tcW w:type="dxa" w:w="4680"/>
+          </w:tcPr>
+          <w:p>
+            <w:r>
+              <w:rPr>
+                <w:sz w:val="20"/>
+              </w:rPr>
+              <w:t>DRF</w:t>
+            </w:r>
+          </w:p>
+        </w:tc>
+        <w:tc>
+          <w:tcPr>
+            <w:tcW w:type="dxa" w:w="4680"/>
+          </w:tcPr>
+          <w:p>
+            <w:r>
+              <w:rPr>
+                <w:sz w:val="20"/>
+              </w:rPr>
+              <w:t>Django REST Framework</w:t>
+            </w:r>
+          </w:p>
+        </w:tc>
+      </w:tr>
+      <w:tr>
+        <w:tc>
+          <w:tcPr>
+            <w:tcW w:type="dxa" w:w="4680"/>
+          </w:tcPr>
+          <w:p>
+            <w:r>
+              <w:rPr>
+                <w:sz w:val="20"/>
+              </w:rPr>
+              <w:t>ORM</w:t>
+            </w:r>
+          </w:p>
+        </w:tc>
+        <w:tc>
+          <w:tcPr>
+            <w:tcW w:type="dxa" w:w="4680"/>
+          </w:tcPr>
+          <w:p>
+            <w:r>
+              <w:rPr>
+                <w:sz w:val="20"/>
+              </w:rPr>
+              <w:t>Object-Relational Mapping</w:t>
+            </w:r>
+          </w:p>
+        </w:tc>
+      </w:tr>
+      <w:tr>
+        <w:tc>
+          <w:tcPr>
+            <w:tcW w:type="dxa" w:w="4680"/>
+          </w:tcPr>
+          <w:p>
+            <w:r>
+              <w:rPr>
+                <w:sz w:val="20"/>
+              </w:rPr>
+              <w:t>3D</w:t>
+            </w:r>
+          </w:p>
+        </w:tc>
+        <w:tc>
+          <w:tcPr>
+            <w:tcW w:type="dxa" w:w="4680"/>
+          </w:tcPr>
+          <w:p>
+            <w:r>
+              <w:rPr>
+                <w:sz w:val="20"/>
+              </w:rPr>
+              <w:t>Three-Dimensional Rendering (three.js)</w:t>
+            </w:r>
+          </w:p>
+        </w:tc>
+      </w:tr>
+      <w:tr>
+        <w:tc>
+          <w:tcPr>
+            <w:tcW w:type="dxa" w:w="4680"/>
+          </w:tcPr>
+          <w:p>
+            <w:r>
+              <w:rPr>
+                <w:sz w:val="20"/>
+              </w:rPr>
+              <w:t>SEO</w:t>
+            </w:r>
+          </w:p>
+        </w:tc>
+        <w:tc>
+          <w:tcPr>
+            <w:tcW w:type="dxa" w:w="4680"/>
+          </w:tcPr>
+          <w:p>
+            <w:r>
+              <w:rPr>
+                <w:sz w:val="20"/>
+              </w:rPr>
+              <w:t>Search Engine Optimization</w:t>
+            </w:r>
+          </w:p>
+        </w:tc>
+      </w:tr>
+      <w:tr>
+        <w:tc>
+          <w:tcPr>
+            <w:tcW w:type="dxa" w:w="4680"/>
+          </w:tcPr>
+          <w:p>
+            <w:r>
+              <w:rPr>
+                <w:sz w:val="20"/>
+              </w:rPr>
+              <w:t>COD</w:t>
+            </w:r>
+          </w:p>
+        </w:tc>
+        <w:tc>
+          <w:tcPr>
+            <w:tcW w:type="dxa" w:w="4680"/>
+          </w:tcPr>
+          <w:p>
+            <w:r>
+              <w:rPr>
+                <w:sz w:val="20"/>
+              </w:rPr>
+              <w:t>Cash on Delivery</w:t>
+            </w:r>
+          </w:p>
+        </w:tc>
+      </w:tr>
+    </w:tbl>
     <w:p>
       <w:pPr>
         <w:pBdr/>

</xml_diff>

<commit_message>
Fix abbreviations table: remove header row, match OneStepPharmacy format
</commit_message>
<xml_diff>
--- a/report/Lustro-Report by Ashwin Sunuwar.docx
+++ b/report/Lustro-Report by Ashwin Sunuwar.docx
@@ -4487,9 +4487,8 @@
     </w:p>
     <w:tbl>
       <w:tblPr>
-        <w:tblStyle w:val="754"/>
         <w:tblW w:type="auto" w:w="0"/>
-        <w:jc w:val="center"/>
+        <w:jc w:val="left"/>
         <w:tblLook w:firstColumn="1" w:firstRow="1" w:lastColumn="0" w:lastRow="0" w:noHBand="0" w:noVBand="1" w:val="04A0"/>
       </w:tblPr>
       <w:tblGrid>
@@ -4502,15 +4501,12 @@
             <w:tcW w:type="dxa" w:w="1701"/>
           </w:tcPr>
           <w:p>
-            <w:pPr>
-              <w:jc w:val="center"/>
-            </w:pPr>
             <w:r>
               <w:rPr>
                 <w:b/>
-                <w:sz w:val="20"/>
+                <w:sz w:val="24"/>
               </w:rPr>
-              <w:t>Abbreviation</w:t>
+              <w:t>OJT</w:t>
             </w:r>
           </w:p>
         </w:tc>
@@ -4519,41 +4515,10 @@
             <w:tcW w:type="dxa" w:w="6803"/>
           </w:tcPr>
           <w:p>
-            <w:pPr>
-              <w:jc w:val="center"/>
-            </w:pPr>
             <w:r>
               <w:rPr>
                 <w:b/>
-                <w:sz w:val="20"/>
-              </w:rPr>
-              <w:t>Full Form</w:t>
-            </w:r>
-          </w:p>
-        </w:tc>
-      </w:tr>
-      <w:tr>
-        <w:tc>
-          <w:tcPr>
-            <w:tcW w:type="dxa" w:w="4680"/>
-          </w:tcPr>
-          <w:p>
-            <w:r>
-              <w:rPr>
-                <w:sz w:val="20"/>
-              </w:rPr>
-              <w:t>OJT</w:t>
-            </w:r>
-          </w:p>
-        </w:tc>
-        <w:tc>
-          <w:tcPr>
-            <w:tcW w:type="dxa" w:w="4680"/>
-          </w:tcPr>
-          <w:p>
-            <w:r>
-              <w:rPr>
-                <w:sz w:val="20"/>
+                <w:sz w:val="24"/>
               </w:rPr>
               <w:t>On-the-Job Training</w:t>
             </w:r>
@@ -4563,12 +4528,13 @@
       <w:tr>
         <w:tc>
           <w:tcPr>
-            <w:tcW w:type="dxa" w:w="4680"/>
+            <w:tcW w:type="dxa" w:w="1701"/>
           </w:tcPr>
           <w:p>
             <w:r>
               <w:rPr>
-                <w:sz w:val="20"/>
+                <w:b/>
+                <w:sz w:val="24"/>
               </w:rPr>
               <w:t>API</w:t>
             </w:r>
@@ -4576,12 +4542,13 @@
         </w:tc>
         <w:tc>
           <w:tcPr>
-            <w:tcW w:type="dxa" w:w="4680"/>
+            <w:tcW w:type="dxa" w:w="6803"/>
           </w:tcPr>
           <w:p>
             <w:r>
               <w:rPr>
-                <w:sz w:val="20"/>
+                <w:b/>
+                <w:sz w:val="24"/>
               </w:rPr>
               <w:t>Application Programming Interface</w:t>
             </w:r>
@@ -4591,12 +4558,13 @@
       <w:tr>
         <w:tc>
           <w:tcPr>
-            <w:tcW w:type="dxa" w:w="4680"/>
+            <w:tcW w:type="dxa" w:w="1701"/>
           </w:tcPr>
           <w:p>
             <w:r>
               <w:rPr>
-                <w:sz w:val="20"/>
+                <w:b/>
+                <w:sz w:val="24"/>
               </w:rPr>
               <w:t>JWT</w:t>
             </w:r>
@@ -4604,12 +4572,13 @@
         </w:tc>
         <w:tc>
           <w:tcPr>
-            <w:tcW w:type="dxa" w:w="4680"/>
+            <w:tcW w:type="dxa" w:w="6803"/>
           </w:tcPr>
           <w:p>
             <w:r>
               <w:rPr>
-                <w:sz w:val="20"/>
+                <w:b/>
+                <w:sz w:val="24"/>
               </w:rPr>
               <w:t>JSON Web Token</w:t>
             </w:r>
@@ -4619,12 +4588,13 @@
       <w:tr>
         <w:tc>
           <w:tcPr>
-            <w:tcW w:type="dxa" w:w="4680"/>
+            <w:tcW w:type="dxa" w:w="1701"/>
           </w:tcPr>
           <w:p>
             <w:r>
               <w:rPr>
-                <w:sz w:val="20"/>
+                <w:b/>
+                <w:sz w:val="24"/>
               </w:rPr>
               <w:t>SPA</w:t>
             </w:r>
@@ -4632,12 +4602,13 @@
         </w:tc>
         <w:tc>
           <w:tcPr>
-            <w:tcW w:type="dxa" w:w="4680"/>
+            <w:tcW w:type="dxa" w:w="6803"/>
           </w:tcPr>
           <w:p>
             <w:r>
               <w:rPr>
-                <w:sz w:val="20"/>
+                <w:b/>
+                <w:sz w:val="24"/>
               </w:rPr>
               <w:t>Single Page Application</w:t>
             </w:r>
@@ -4647,12 +4618,13 @@
       <w:tr>
         <w:tc>
           <w:tcPr>
-            <w:tcW w:type="dxa" w:w="4680"/>
+            <w:tcW w:type="dxa" w:w="1701"/>
           </w:tcPr>
           <w:p>
             <w:r>
               <w:rPr>
-                <w:sz w:val="20"/>
+                <w:b/>
+                <w:sz w:val="24"/>
               </w:rPr>
               <w:t>DRF</w:t>
             </w:r>
@@ -4660,12 +4632,13 @@
         </w:tc>
         <w:tc>
           <w:tcPr>
-            <w:tcW w:type="dxa" w:w="4680"/>
+            <w:tcW w:type="dxa" w:w="6803"/>
           </w:tcPr>
           <w:p>
             <w:r>
               <w:rPr>
-                <w:sz w:val="20"/>
+                <w:b/>
+                <w:sz w:val="24"/>
               </w:rPr>
               <w:t>Django REST Framework</w:t>
             </w:r>
@@ -4675,12 +4648,13 @@
       <w:tr>
         <w:tc>
           <w:tcPr>
-            <w:tcW w:type="dxa" w:w="4680"/>
+            <w:tcW w:type="dxa" w:w="1701"/>
           </w:tcPr>
           <w:p>
             <w:r>
               <w:rPr>
-                <w:sz w:val="20"/>
+                <w:b/>
+                <w:sz w:val="24"/>
               </w:rPr>
               <w:t>ORM</w:t>
             </w:r>
@@ -4688,12 +4662,13 @@
         </w:tc>
         <w:tc>
           <w:tcPr>
-            <w:tcW w:type="dxa" w:w="4680"/>
+            <w:tcW w:type="dxa" w:w="6803"/>
           </w:tcPr>
           <w:p>
             <w:r>
               <w:rPr>
-                <w:sz w:val="20"/>
+                <w:b/>
+                <w:sz w:val="24"/>
               </w:rPr>
               <w:t>Object-Relational Mapping</w:t>
             </w:r>
@@ -4703,12 +4678,13 @@
       <w:tr>
         <w:tc>
           <w:tcPr>
-            <w:tcW w:type="dxa" w:w="4680"/>
+            <w:tcW w:type="dxa" w:w="1701"/>
           </w:tcPr>
           <w:p>
             <w:r>
               <w:rPr>
-                <w:sz w:val="20"/>
+                <w:b/>
+                <w:sz w:val="24"/>
               </w:rPr>
               <w:t>3D</w:t>
             </w:r>
@@ -4716,12 +4692,13 @@
         </w:tc>
         <w:tc>
           <w:tcPr>
-            <w:tcW w:type="dxa" w:w="4680"/>
+            <w:tcW w:type="dxa" w:w="6803"/>
           </w:tcPr>
           <w:p>
             <w:r>
               <w:rPr>
-                <w:sz w:val="20"/>
+                <w:b/>
+                <w:sz w:val="24"/>
               </w:rPr>
               <w:t>Three-Dimensional Rendering (three.js)</w:t>
             </w:r>
@@ -4731,12 +4708,13 @@
       <w:tr>
         <w:tc>
           <w:tcPr>
-            <w:tcW w:type="dxa" w:w="4680"/>
+            <w:tcW w:type="dxa" w:w="1701"/>
           </w:tcPr>
           <w:p>
             <w:r>
               <w:rPr>
-                <w:sz w:val="20"/>
+                <w:b/>
+                <w:sz w:val="24"/>
               </w:rPr>
               <w:t>SEO</w:t>
             </w:r>
@@ -4744,12 +4722,13 @@
         </w:tc>
         <w:tc>
           <w:tcPr>
-            <w:tcW w:type="dxa" w:w="4680"/>
+            <w:tcW w:type="dxa" w:w="6803"/>
           </w:tcPr>
           <w:p>
             <w:r>
               <w:rPr>
-                <w:sz w:val="20"/>
+                <w:b/>
+                <w:sz w:val="24"/>
               </w:rPr>
               <w:t>Search Engine Optimization</w:t>
             </w:r>
@@ -4759,12 +4738,13 @@
       <w:tr>
         <w:tc>
           <w:tcPr>
-            <w:tcW w:type="dxa" w:w="4680"/>
+            <w:tcW w:type="dxa" w:w="1701"/>
           </w:tcPr>
           <w:p>
             <w:r>
               <w:rPr>
-                <w:sz w:val="20"/>
+                <w:b/>
+                <w:sz w:val="24"/>
               </w:rPr>
               <w:t>COD</w:t>
             </w:r>
@@ -4772,12 +4752,13 @@
         </w:tc>
         <w:tc>
           <w:tcPr>
-            <w:tcW w:type="dxa" w:w="4680"/>
+            <w:tcW w:type="dxa" w:w="6803"/>
           </w:tcPr>
           <w:p>
             <w:r>
               <w:rPr>
-                <w:sz w:val="20"/>
+                <w:b/>
+                <w:sz w:val="24"/>
               </w:rPr>
               <w:t>Cash on Delivery</w:t>
             </w:r>

</xml_diff>

<commit_message>
Update report screenshots: admin404, reviews section, search modal, fix abbreviations table
- image4: Shop page with filters sidebar
- image5: Search modal with rolex query + popular searches
- image6: Chat widget open
- image7: Django admin404 debug page
- image9: Cart page
- image10: Collector Reviews section with rating + sign-in prompt
- Abbreviations: removed header row, bold data rows (matches OneStepPharmacy)
</commit_message>
<xml_diff>
--- a/report/Lustro-Report by Ashwin Sunuwar.docx
+++ b/report/Lustro-Report by Ashwin Sunuwar.docx
@@ -4485,258 +4485,287 @@
         </w:rPr>
       </w:r>
     </w:p>
-    <w:p>
-      <w:pPr>
-        <w:pBdr/>
-        <w:spacing w:after="60" w:before="60" w:line="480" w:lineRule="auto"/>
-        <w:ind w:hanging="720" w:left="720"/>
-        <w:rPr/>
-      </w:pPr>
-      <w:r>
-        <w:rPr>
-          <w:b/>
-          <w:bCs/>
-          <w:rFonts w:ascii="Times New Roman" w:hAnsi="Times New Roman" w:eastAsia="Times New Roman" w:cs="Times New Roman"/>
-          <w:sz w:val="24"/>
-          <w:szCs w:val="24"/>
-          <w:rtl w:val="0"/>
-        </w:rPr>
-        <w:t xml:space="preserve">OJT</w:t>
-      </w:r>
-      <w:r>
-        <w:rPr>
-          <w:rFonts w:ascii="Times New Roman" w:hAnsi="Times New Roman" w:eastAsia="Times New Roman" w:cs="Times New Roman"/>
-          <w:sz w:val="24"/>
-          <w:szCs w:val="24"/>
-          <w:rtl w:val="0"/>
-        </w:rPr>
-        <w:t xml:space="preserve"> :  On-the-Job Training</w:t>
-      </w:r>
-    </w:p>
-    <w:p>
-      <w:pPr>
-        <w:pBdr/>
-        <w:spacing w:after="60" w:before="60" w:line="480" w:lineRule="auto"/>
-        <w:ind w:hanging="720" w:left="720"/>
-        <w:rPr/>
-      </w:pPr>
-      <w:r>
-        <w:rPr>
-          <w:b/>
-          <w:bCs/>
-          <w:rFonts w:ascii="Times New Roman" w:hAnsi="Times New Roman" w:eastAsia="Times New Roman" w:cs="Times New Roman"/>
-          <w:sz w:val="24"/>
-          <w:szCs w:val="24"/>
-          <w:rtl w:val="0"/>
-        </w:rPr>
-        <w:t xml:space="preserve">API</w:t>
-      </w:r>
-      <w:r>
-        <w:rPr>
-          <w:rFonts w:ascii="Times New Roman" w:hAnsi="Times New Roman" w:eastAsia="Times New Roman" w:cs="Times New Roman"/>
-          <w:sz w:val="24"/>
-          <w:szCs w:val="24"/>
-          <w:rtl w:val="0"/>
-        </w:rPr>
-        <w:t xml:space="preserve"> :  Application Programming Interface</w:t>
-      </w:r>
-    </w:p>
-    <w:p>
-      <w:pPr>
-        <w:pBdr/>
-        <w:spacing w:after="60" w:before="60" w:line="480" w:lineRule="auto"/>
-        <w:ind w:hanging="720" w:left="720"/>
-        <w:rPr/>
-      </w:pPr>
-      <w:r>
-        <w:rPr>
-          <w:b/>
-          <w:bCs/>
-          <w:rFonts w:ascii="Times New Roman" w:hAnsi="Times New Roman" w:eastAsia="Times New Roman" w:cs="Times New Roman"/>
-          <w:sz w:val="24"/>
-          <w:szCs w:val="24"/>
-          <w:rtl w:val="0"/>
-        </w:rPr>
-        <w:t xml:space="preserve">JWT</w:t>
-      </w:r>
-      <w:r>
-        <w:rPr>
-          <w:rFonts w:ascii="Times New Roman" w:hAnsi="Times New Roman" w:eastAsia="Times New Roman" w:cs="Times New Roman"/>
-          <w:sz w:val="24"/>
-          <w:szCs w:val="24"/>
-          <w:rtl w:val="0"/>
-        </w:rPr>
-        <w:t xml:space="preserve"> :  JSON Web Token</w:t>
-      </w:r>
-    </w:p>
-    <w:p>
-      <w:pPr>
-        <w:pBdr/>
-        <w:spacing w:after="60" w:before="60" w:line="480" w:lineRule="auto"/>
-        <w:ind w:hanging="720" w:left="720"/>
-        <w:rPr/>
-      </w:pPr>
-      <w:r>
-        <w:rPr>
-          <w:b/>
-          <w:bCs/>
-          <w:rFonts w:ascii="Times New Roman" w:hAnsi="Times New Roman" w:eastAsia="Times New Roman" w:cs="Times New Roman"/>
-          <w:sz w:val="24"/>
-          <w:szCs w:val="24"/>
-          <w:rtl w:val="0"/>
-        </w:rPr>
-        <w:t xml:space="preserve">SPA</w:t>
-      </w:r>
-      <w:r>
-        <w:rPr>
-          <w:rFonts w:ascii="Times New Roman" w:hAnsi="Times New Roman" w:eastAsia="Times New Roman" w:cs="Times New Roman"/>
-          <w:sz w:val="24"/>
-          <w:szCs w:val="24"/>
-          <w:rtl w:val="0"/>
-        </w:rPr>
-        <w:t xml:space="preserve"> :  Single Page Application</w:t>
-      </w:r>
-    </w:p>
-    <w:p>
-      <w:pPr>
-        <w:pBdr/>
-        <w:spacing w:after="60" w:before="60" w:line="480" w:lineRule="auto"/>
-        <w:ind w:hanging="720" w:left="720"/>
-        <w:rPr/>
-      </w:pPr>
-      <w:r>
-        <w:rPr>
-          <w:b/>
-          <w:bCs/>
-          <w:rFonts w:ascii="Times New Roman" w:hAnsi="Times New Roman" w:eastAsia="Times New Roman" w:cs="Times New Roman"/>
-          <w:sz w:val="24"/>
-          <w:szCs w:val="24"/>
-          <w:rtl w:val="0"/>
-        </w:rPr>
-        <w:t xml:space="preserve">DRF</w:t>
-      </w:r>
-      <w:r>
-        <w:rPr>
-          <w:rFonts w:ascii="Times New Roman" w:hAnsi="Times New Roman" w:eastAsia="Times New Roman" w:cs="Times New Roman"/>
-          <w:sz w:val="24"/>
-          <w:szCs w:val="24"/>
-          <w:rtl w:val="0"/>
-        </w:rPr>
-        <w:t xml:space="preserve"> :  Django REST Framework</w:t>
-      </w:r>
-    </w:p>
-    <w:p>
-      <w:pPr>
-        <w:pBdr/>
-        <w:spacing w:after="60" w:before="60" w:line="480" w:lineRule="auto"/>
-        <w:ind w:hanging="720" w:left="720"/>
-        <w:rPr/>
-      </w:pPr>
-      <w:r>
-        <w:rPr>
-          <w:b/>
-          <w:bCs/>
-          <w:rFonts w:ascii="Times New Roman" w:hAnsi="Times New Roman" w:eastAsia="Times New Roman" w:cs="Times New Roman"/>
-          <w:sz w:val="24"/>
-          <w:szCs w:val="24"/>
-          <w:rtl w:val="0"/>
-        </w:rPr>
-        <w:t xml:space="preserve">ORM</w:t>
-      </w:r>
-      <w:r>
-        <w:rPr>
-          <w:rFonts w:ascii="Times New Roman" w:hAnsi="Times New Roman" w:eastAsia="Times New Roman" w:cs="Times New Roman"/>
-          <w:sz w:val="24"/>
-          <w:szCs w:val="24"/>
-          <w:rtl w:val="0"/>
-        </w:rPr>
-        <w:t xml:space="preserve"> :  Object-Relational Mapping</w:t>
-      </w:r>
-    </w:p>
-    <w:p>
-      <w:pPr>
-        <w:pBdr/>
-        <w:spacing w:after="60" w:before="60" w:line="480" w:lineRule="auto"/>
-        <w:ind w:hanging="720" w:left="720"/>
-        <w:rPr/>
-      </w:pPr>
-      <w:r>
-        <w:rPr>
-          <w:b/>
-          <w:bCs/>
-          <w:rFonts w:ascii="Times New Roman" w:hAnsi="Times New Roman" w:eastAsia="Times New Roman" w:cs="Times New Roman"/>
-          <w:sz w:val="24"/>
-          <w:szCs w:val="24"/>
-          <w:rtl w:val="0"/>
-        </w:rPr>
-        <w:t xml:space="preserve">3D</w:t>
-      </w:r>
-      <w:r>
-        <w:rPr>
-          <w:rFonts w:ascii="Times New Roman" w:hAnsi="Times New Roman" w:eastAsia="Times New Roman" w:cs="Times New Roman"/>
-          <w:sz w:val="24"/>
-          <w:szCs w:val="24"/>
-          <w:rtl w:val="0"/>
-        </w:rPr>
-        <w:t xml:space="preserve"> :  Three-Dimensional Rendering (three.js)</w:t>
-      </w:r>
-    </w:p>
-    <w:p>
-      <w:pPr>
-        <w:pBdr/>
-        <w:spacing w:after="60" w:before="60" w:line="480" w:lineRule="auto"/>
-        <w:ind w:hanging="720" w:left="720"/>
-        <w:rPr/>
-      </w:pPr>
-      <w:r>
-        <w:rPr>
-          <w:b/>
-          <w:bCs/>
-          <w:rFonts w:ascii="Times New Roman" w:hAnsi="Times New Roman" w:eastAsia="Times New Roman" w:cs="Times New Roman"/>
-          <w:sz w:val="24"/>
-          <w:szCs w:val="24"/>
-          <w:rtl w:val="0"/>
-        </w:rPr>
-        <w:t xml:space="preserve">SEO</w:t>
-      </w:r>
-      <w:r>
-        <w:rPr>
-          <w:rFonts w:ascii="Times New Roman" w:hAnsi="Times New Roman" w:eastAsia="Times New Roman" w:cs="Times New Roman"/>
-          <w:sz w:val="24"/>
-          <w:szCs w:val="24"/>
-          <w:rtl w:val="0"/>
-        </w:rPr>
-        <w:t xml:space="preserve"> :  Search Engine Optimization</w:t>
-      </w:r>
-    </w:p>
-    <w:p>
-      <w:pPr>
-        <w:pBdr/>
-        <w:spacing w:after="60" w:before="60" w:line="480" w:lineRule="auto"/>
-        <w:ind w:hanging="720" w:left="720"/>
-        <w:rPr/>
-      </w:pPr>
-      <w:r>
-        <w:rPr>
-          <w:b/>
-          <w:bCs/>
-          <w:rFonts w:ascii="Times New Roman" w:hAnsi="Times New Roman" w:eastAsia="Times New Roman" w:cs="Times New Roman"/>
-          <w:sz w:val="24"/>
-          <w:szCs w:val="24"/>
-          <w:rtl w:val="0"/>
-        </w:rPr>
-        <w:t xml:space="preserve">COD</w:t>
-      </w:r>
-      <w:r>
-        <w:rPr>
-          <w:rFonts w:ascii="Times New Roman" w:hAnsi="Times New Roman" w:eastAsia="Times New Roman" w:cs="Times New Roman"/>
-          <w:sz w:val="24"/>
-          <w:szCs w:val="24"/>
-          <w:rtl w:val="0"/>
-        </w:rPr>
-        <w:t xml:space="preserve"> :  Cash on Delivery</w:t>
-      </w:r>
-    </w:p>
+    <w:tbl>
+      <w:tblPr>
+        <w:tblW w:type="auto" w:w="0"/>
+        <w:jc w:val="left"/>
+        <w:tblLook w:firstColumn="1" w:firstRow="1" w:lastColumn="0" w:lastRow="0" w:noHBand="0" w:noVBand="1" w:val="04A0"/>
+      </w:tblPr>
+      <w:tblGrid>
+        <w:gridCol w:w="4680"/>
+        <w:gridCol w:w="4680"/>
+      </w:tblGrid>
+      <w:tr>
+        <w:tc>
+          <w:tcPr>
+            <w:tcW w:type="dxa" w:w="1701"/>
+          </w:tcPr>
+          <w:p>
+            <w:r>
+              <w:rPr>
+                <w:b/>
+                <w:sz w:val="24"/>
+              </w:rPr>
+              <w:t>OJT</w:t>
+            </w:r>
+          </w:p>
+        </w:tc>
+        <w:tc>
+          <w:tcPr>
+            <w:tcW w:type="dxa" w:w="6803"/>
+          </w:tcPr>
+          <w:p>
+            <w:r>
+              <w:rPr>
+                <w:b/>
+                <w:sz w:val="24"/>
+              </w:rPr>
+              <w:t>On-the-Job Training</w:t>
+            </w:r>
+          </w:p>
+        </w:tc>
+      </w:tr>
+      <w:tr>
+        <w:tc>
+          <w:tcPr>
+            <w:tcW w:type="dxa" w:w="1701"/>
+          </w:tcPr>
+          <w:p>
+            <w:r>
+              <w:rPr>
+                <w:b/>
+                <w:sz w:val="24"/>
+              </w:rPr>
+              <w:t>API</w:t>
+            </w:r>
+          </w:p>
+        </w:tc>
+        <w:tc>
+          <w:tcPr>
+            <w:tcW w:type="dxa" w:w="6803"/>
+          </w:tcPr>
+          <w:p>
+            <w:r>
+              <w:rPr>
+                <w:b/>
+                <w:sz w:val="24"/>
+              </w:rPr>
+              <w:t>Application Programming Interface</w:t>
+            </w:r>
+          </w:p>
+        </w:tc>
+      </w:tr>
+      <w:tr>
+        <w:tc>
+          <w:tcPr>
+            <w:tcW w:type="dxa" w:w="1701"/>
+          </w:tcPr>
+          <w:p>
+            <w:r>
+              <w:rPr>
+                <w:b/>
+                <w:sz w:val="24"/>
+              </w:rPr>
+              <w:t>JWT</w:t>
+            </w:r>
+          </w:p>
+        </w:tc>
+        <w:tc>
+          <w:tcPr>
+            <w:tcW w:type="dxa" w:w="6803"/>
+          </w:tcPr>
+          <w:p>
+            <w:r>
+              <w:rPr>
+                <w:b/>
+                <w:sz w:val="24"/>
+              </w:rPr>
+              <w:t>JSON Web Token</w:t>
+            </w:r>
+          </w:p>
+        </w:tc>
+      </w:tr>
+      <w:tr>
+        <w:tc>
+          <w:tcPr>
+            <w:tcW w:type="dxa" w:w="1701"/>
+          </w:tcPr>
+          <w:p>
+            <w:r>
+              <w:rPr>
+                <w:b/>
+                <w:sz w:val="24"/>
+              </w:rPr>
+              <w:t>SPA</w:t>
+            </w:r>
+          </w:p>
+        </w:tc>
+        <w:tc>
+          <w:tcPr>
+            <w:tcW w:type="dxa" w:w="6803"/>
+          </w:tcPr>
+          <w:p>
+            <w:r>
+              <w:rPr>
+                <w:b/>
+                <w:sz w:val="24"/>
+              </w:rPr>
+              <w:t>Single Page Application</w:t>
+            </w:r>
+          </w:p>
+        </w:tc>
+      </w:tr>
+      <w:tr>
+        <w:tc>
+          <w:tcPr>
+            <w:tcW w:type="dxa" w:w="1701"/>
+          </w:tcPr>
+          <w:p>
+            <w:r>
+              <w:rPr>
+                <w:b/>
+                <w:sz w:val="24"/>
+              </w:rPr>
+              <w:t>DRF</w:t>
+            </w:r>
+          </w:p>
+        </w:tc>
+        <w:tc>
+          <w:tcPr>
+            <w:tcW w:type="dxa" w:w="6803"/>
+          </w:tcPr>
+          <w:p>
+            <w:r>
+              <w:rPr>
+                <w:b/>
+                <w:sz w:val="24"/>
+              </w:rPr>
+              <w:t>Django REST Framework</w:t>
+            </w:r>
+          </w:p>
+        </w:tc>
+      </w:tr>
+      <w:tr>
+        <w:tc>
+          <w:tcPr>
+            <w:tcW w:type="dxa" w:w="1701"/>
+          </w:tcPr>
+          <w:p>
+            <w:r>
+              <w:rPr>
+                <w:b/>
+                <w:sz w:val="24"/>
+              </w:rPr>
+              <w:t>ORM</w:t>
+            </w:r>
+          </w:p>
+        </w:tc>
+        <w:tc>
+          <w:tcPr>
+            <w:tcW w:type="dxa" w:w="6803"/>
+          </w:tcPr>
+          <w:p>
+            <w:r>
+              <w:rPr>
+                <w:b/>
+                <w:sz w:val="24"/>
+              </w:rPr>
+              <w:t>Object-Relational Mapping</w:t>
+            </w:r>
+          </w:p>
+        </w:tc>
+      </w:tr>
+      <w:tr>
+        <w:tc>
+          <w:tcPr>
+            <w:tcW w:type="dxa" w:w="1701"/>
+          </w:tcPr>
+          <w:p>
+            <w:r>
+              <w:rPr>
+                <w:b/>
+                <w:sz w:val="24"/>
+              </w:rPr>
+              <w:t>3D</w:t>
+            </w:r>
+          </w:p>
+        </w:tc>
+        <w:tc>
+          <w:tcPr>
+            <w:tcW w:type="dxa" w:w="6803"/>
+          </w:tcPr>
+          <w:p>
+            <w:r>
+              <w:rPr>
+                <w:b/>
+                <w:sz w:val="24"/>
+              </w:rPr>
+              <w:t>Three-Dimensional Rendering (three.js)</w:t>
+            </w:r>
+          </w:p>
+        </w:tc>
+      </w:tr>
+      <w:tr>
+        <w:tc>
+          <w:tcPr>
+            <w:tcW w:type="dxa" w:w="1701"/>
+          </w:tcPr>
+          <w:p>
+            <w:r>
+              <w:rPr>
+                <w:b/>
+                <w:sz w:val="24"/>
+              </w:rPr>
+              <w:t>SEO</w:t>
+            </w:r>
+          </w:p>
+        </w:tc>
+        <w:tc>
+          <w:tcPr>
+            <w:tcW w:type="dxa" w:w="6803"/>
+          </w:tcPr>
+          <w:p>
+            <w:r>
+              <w:rPr>
+                <w:b/>
+                <w:sz w:val="24"/>
+              </w:rPr>
+              <w:t>Search Engine Optimization</w:t>
+            </w:r>
+          </w:p>
+        </w:tc>
+      </w:tr>
+      <w:tr>
+        <w:tc>
+          <w:tcPr>
+            <w:tcW w:type="dxa" w:w="1701"/>
+          </w:tcPr>
+          <w:p>
+            <w:r>
+              <w:rPr>
+                <w:b/>
+                <w:sz w:val="24"/>
+              </w:rPr>
+              <w:t>COD</w:t>
+            </w:r>
+          </w:p>
+        </w:tc>
+        <w:tc>
+          <w:tcPr>
+            <w:tcW w:type="dxa" w:w="6803"/>
+          </w:tcPr>
+          <w:p>
+            <w:r>
+              <w:rPr>
+                <w:b/>
+                <w:sz w:val="24"/>
+              </w:rPr>
+              <w:t>Cash on Delivery</w:t>
+            </w:r>
+          </w:p>
+        </w:tc>
+      </w:tr>
+    </w:tbl>
     <w:p>
       <w:pPr>
         <w:pBdr/>

</xml_diff>

<commit_message>
Update report with user screenshots: landing, product, chat, footer
</commit_message>
<xml_diff>
--- a/report/Lustro-Report by Ashwin Sunuwar.docx
+++ b/report/Lustro-Report by Ashwin Sunuwar.docx
@@ -4498,9 +4498,12 @@
       <w:tr>
         <w:tc>
           <w:tcPr>
-            <w:tcW w:type="dxa" w:w="1701"/>
+            <w:tcW w:type="dxa" w:w="4515"/>
           </w:tcPr>
           <w:p>
+            <w:pPr>
+              <w:spacing w:before="60" w:after="60"/>
+            </w:pPr>
             <w:r>
               <w:rPr>
                 <w:b/>
@@ -4512,12 +4515,15 @@
         </w:tc>
         <w:tc>
           <w:tcPr>
-            <w:tcW w:type="dxa" w:w="6803"/>
+            <w:tcW w:type="dxa" w:w="4515"/>
           </w:tcPr>
           <w:p>
+            <w:pPr>
+              <w:spacing w:before="60" w:after="60"/>
+            </w:pPr>
             <w:r>
               <w:rPr>
-                <w:b/>
+                <w:b w:val="0"/>
                 <w:sz w:val="24"/>
               </w:rPr>
               <w:t>On-the-Job Training</w:t>
@@ -4528,9 +4534,12 @@
       <w:tr>
         <w:tc>
           <w:tcPr>
-            <w:tcW w:type="dxa" w:w="1701"/>
+            <w:tcW w:type="dxa" w:w="4515"/>
           </w:tcPr>
           <w:p>
+            <w:pPr>
+              <w:spacing w:before="60" w:after="60"/>
+            </w:pPr>
             <w:r>
               <w:rPr>
                 <w:b/>
@@ -4542,12 +4551,15 @@
         </w:tc>
         <w:tc>
           <w:tcPr>
-            <w:tcW w:type="dxa" w:w="6803"/>
+            <w:tcW w:type="dxa" w:w="4515"/>
           </w:tcPr>
           <w:p>
+            <w:pPr>
+              <w:spacing w:before="60" w:after="60"/>
+            </w:pPr>
             <w:r>
               <w:rPr>
-                <w:b/>
+                <w:b w:val="0"/>
                 <w:sz w:val="24"/>
               </w:rPr>
               <w:t>Application Programming Interface</w:t>
@@ -4558,9 +4570,12 @@
       <w:tr>
         <w:tc>
           <w:tcPr>
-            <w:tcW w:type="dxa" w:w="1701"/>
+            <w:tcW w:type="dxa" w:w="4515"/>
           </w:tcPr>
           <w:p>
+            <w:pPr>
+              <w:spacing w:before="60" w:after="60"/>
+            </w:pPr>
             <w:r>
               <w:rPr>
                 <w:b/>
@@ -4572,12 +4587,15 @@
         </w:tc>
         <w:tc>
           <w:tcPr>
-            <w:tcW w:type="dxa" w:w="6803"/>
+            <w:tcW w:type="dxa" w:w="4515"/>
           </w:tcPr>
           <w:p>
+            <w:pPr>
+              <w:spacing w:before="60" w:after="60"/>
+            </w:pPr>
             <w:r>
               <w:rPr>
-                <w:b/>
+                <w:b w:val="0"/>
                 <w:sz w:val="24"/>
               </w:rPr>
               <w:t>JSON Web Token</w:t>
@@ -4588,9 +4606,12 @@
       <w:tr>
         <w:tc>
           <w:tcPr>
-            <w:tcW w:type="dxa" w:w="1701"/>
+            <w:tcW w:type="dxa" w:w="4515"/>
           </w:tcPr>
           <w:p>
+            <w:pPr>
+              <w:spacing w:before="60" w:after="60"/>
+            </w:pPr>
             <w:r>
               <w:rPr>
                 <w:b/>
@@ -4602,12 +4623,15 @@
         </w:tc>
         <w:tc>
           <w:tcPr>
-            <w:tcW w:type="dxa" w:w="6803"/>
+            <w:tcW w:type="dxa" w:w="4515"/>
           </w:tcPr>
           <w:p>
+            <w:pPr>
+              <w:spacing w:before="60" w:after="60"/>
+            </w:pPr>
             <w:r>
               <w:rPr>
-                <w:b/>
+                <w:b w:val="0"/>
                 <w:sz w:val="24"/>
               </w:rPr>
               <w:t>Single Page Application</w:t>
@@ -4618,9 +4642,12 @@
       <w:tr>
         <w:tc>
           <w:tcPr>
-            <w:tcW w:type="dxa" w:w="1701"/>
+            <w:tcW w:type="dxa" w:w="4515"/>
           </w:tcPr>
           <w:p>
+            <w:pPr>
+              <w:spacing w:before="60" w:after="60"/>
+            </w:pPr>
             <w:r>
               <w:rPr>
                 <w:b/>
@@ -4632,12 +4659,15 @@
         </w:tc>
         <w:tc>
           <w:tcPr>
-            <w:tcW w:type="dxa" w:w="6803"/>
+            <w:tcW w:type="dxa" w:w="4515"/>
           </w:tcPr>
           <w:p>
+            <w:pPr>
+              <w:spacing w:before="60" w:after="60"/>
+            </w:pPr>
             <w:r>
               <w:rPr>
-                <w:b/>
+                <w:b w:val="0"/>
                 <w:sz w:val="24"/>
               </w:rPr>
               <w:t>Django REST Framework</w:t>
@@ -4648,9 +4678,12 @@
       <w:tr>
         <w:tc>
           <w:tcPr>
-            <w:tcW w:type="dxa" w:w="1701"/>
+            <w:tcW w:type="dxa" w:w="4515"/>
           </w:tcPr>
           <w:p>
+            <w:pPr>
+              <w:spacing w:before="60" w:after="60"/>
+            </w:pPr>
             <w:r>
               <w:rPr>
                 <w:b/>
@@ -4662,12 +4695,15 @@
         </w:tc>
         <w:tc>
           <w:tcPr>
-            <w:tcW w:type="dxa" w:w="6803"/>
+            <w:tcW w:type="dxa" w:w="4515"/>
           </w:tcPr>
           <w:p>
+            <w:pPr>
+              <w:spacing w:before="60" w:after="60"/>
+            </w:pPr>
             <w:r>
               <w:rPr>
-                <w:b/>
+                <w:b w:val="0"/>
                 <w:sz w:val="24"/>
               </w:rPr>
               <w:t>Object-Relational Mapping</w:t>
@@ -4678,9 +4714,12 @@
       <w:tr>
         <w:tc>
           <w:tcPr>
-            <w:tcW w:type="dxa" w:w="1701"/>
+            <w:tcW w:type="dxa" w:w="4515"/>
           </w:tcPr>
           <w:p>
+            <w:pPr>
+              <w:spacing w:before="60" w:after="60"/>
+            </w:pPr>
             <w:r>
               <w:rPr>
                 <w:b/>
@@ -4692,12 +4731,15 @@
         </w:tc>
         <w:tc>
           <w:tcPr>
-            <w:tcW w:type="dxa" w:w="6803"/>
+            <w:tcW w:type="dxa" w:w="4515"/>
           </w:tcPr>
           <w:p>
+            <w:pPr>
+              <w:spacing w:before="60" w:after="60"/>
+            </w:pPr>
             <w:r>
               <w:rPr>
-                <w:b/>
+                <w:b w:val="0"/>
                 <w:sz w:val="24"/>
               </w:rPr>
               <w:t>Three-Dimensional Rendering (three.js)</w:t>
@@ -4708,9 +4750,12 @@
       <w:tr>
         <w:tc>
           <w:tcPr>
-            <w:tcW w:type="dxa" w:w="1701"/>
+            <w:tcW w:type="dxa" w:w="4515"/>
           </w:tcPr>
           <w:p>
+            <w:pPr>
+              <w:spacing w:before="60" w:after="60"/>
+            </w:pPr>
             <w:r>
               <w:rPr>
                 <w:b/>
@@ -4722,12 +4767,15 @@
         </w:tc>
         <w:tc>
           <w:tcPr>
-            <w:tcW w:type="dxa" w:w="6803"/>
+            <w:tcW w:type="dxa" w:w="4515"/>
           </w:tcPr>
           <w:p>
+            <w:pPr>
+              <w:spacing w:before="60" w:after="60"/>
+            </w:pPr>
             <w:r>
               <w:rPr>
-                <w:b/>
+                <w:b w:val="0"/>
                 <w:sz w:val="24"/>
               </w:rPr>
               <w:t>Search Engine Optimization</w:t>
@@ -4738,9 +4786,12 @@
       <w:tr>
         <w:tc>
           <w:tcPr>
-            <w:tcW w:type="dxa" w:w="1701"/>
+            <w:tcW w:type="dxa" w:w="4515"/>
           </w:tcPr>
           <w:p>
+            <w:pPr>
+              <w:spacing w:before="60" w:after="60"/>
+            </w:pPr>
             <w:r>
               <w:rPr>
                 <w:b/>
@@ -4752,12 +4803,15 @@
         </w:tc>
         <w:tc>
           <w:tcPr>
-            <w:tcW w:type="dxa" w:w="6803"/>
+            <w:tcW w:type="dxa" w:w="4515"/>
           </w:tcPr>
           <w:p>
+            <w:pPr>
+              <w:spacing w:before="60" w:after="60"/>
+            </w:pPr>
             <w:r>
               <w:rPr>
-                <w:b/>
+                <w:b w:val="0"/>
                 <w:sz w:val="24"/>
               </w:rPr>
               <w:t>Cash on Delivery</w:t>

</xml_diff>

<commit_message>
Update report: fix images, remove sections, add PDF
- image2 (3.3.2): feateredproduct.png
- image3 (3.3.3): caegotycollection.png
- image8 (3.3.7): reverted to previous
- image10 (3.3.9): checkout.png
- Removed 3.3.7 Comprehensive Django Admin Dashboard
- Removed 3.3.11 Customer Feedback & Review System
- Renumbered: 3.3.7→3.3.8, 3.3.8→3.3.9, 3.3.9→3.3.10
- Added PDF export
</commit_message>
<xml_diff>
--- a/report/Lustro-Report by Ashwin Sunuwar.docx
+++ b/report/Lustro-Report by Ashwin Sunuwar.docx
@@ -7076,49 +7076,6 @@
     </w:p>
     <w:p>
       <w:pPr>
-        <w:keepNext w:val="false"/>
-        <w:keepLines w:val="true"/>
-        <w:pageBreakBefore w:val="false"/>
-        <w:pBdr/>
-        <w:spacing w:after="120" w:before="0" w:line="480" w:lineRule="auto"/>
-        <w:ind/>
-        <w:rPr>
-          <w:rFonts w:ascii="Times New Roman" w:hAnsi="Times New Roman" w:eastAsia="Times New Roman" w:cs="Times New Roman"/>
-          <w:b/>
-          <w:bCs/>
-          <w:color w:val="000000"/>
-          <w:sz w:val="24"/>
-          <w:szCs w:val="24"/>
-        </w:rPr>
-      </w:pPr>
-      <w:r>
-        <w:rPr>
-          <w:rFonts w:ascii="Times New Roman" w:hAnsi="Times New Roman" w:eastAsia="Times New Roman" w:cs="Times New Roman"/>
-          <w:color w:val="000000"/>
-          <w:sz w:val="24"/>
-          <w:szCs w:val="24"/>
-          <w:rtl w:val="0"/>
-        </w:rPr>
-        <w:t xml:space="preserve">Comprehensive Django Admin Dashboard</w:t>
-      </w:r>
-    </w:p>
-    <w:p>
-      <w:pPr>
-        <w:keepLines w:val="true"/>
-        <w:pBdr/>
-        <w:spacing w:after="120" w:line="480" w:lineRule="auto"/>
-        <w:ind/>
-        <w:rPr/>
-      </w:pPr>
-      <w:r>
-        <w:rPr>
-          <w:rtl w:val="0"/>
-        </w:rPr>
-        <w:t xml:space="preserve">The Django admin dashboard is a comprehensive management suite covering watches, brands, orders, coupons, waitlists, newsletters, and chat appointments.</w:t>
-      </w:r>
-    </w:p>
-    <w:p>
-      <w:pPr>
         <w:keepLines w:val="true"/>
         <w:pBdr/>
         <w:spacing w:after="120" w:line="480" w:lineRule="auto"/>
@@ -7226,7 +7183,7 @@
           <w:szCs w:val="24"/>
           <w:rtl w:val="0"/>
         </w:rPr>
-        <w:t xml:space="preserve">3.3.8  Detailed Product Architecture</w:t>
+        <w:t>3.3.7  Detailed Product Architecture</w:t>
       </w:r>
       <w:r/>
     </w:p>
@@ -7343,7 +7300,7 @@
           <w:szCs w:val="24"/>
           <w:rtl w:val="0"/>
         </w:rPr>
-        <w:t xml:space="preserve">3.3.9  Logic-Heavy Multi-Store Cart</w:t>
+        <w:t>3.3.8  Logic-Heavy Multi-Store Cart</w:t>
       </w:r>
       <w:r/>
     </w:p>
@@ -7460,7 +7417,7 @@
           <w:szCs w:val="24"/>
           <w:rtl w:val="0"/>
         </w:rPr>
-        <w:t xml:space="preserve">3.3.10  Secure Multi-Step Checkout</w:t>
+        <w:t>3.3.9  Secure Multi-Step Checkout</w:t>
       </w:r>
       <w:r/>
     </w:p>
@@ -7560,45 +7517,6 @@
     </w:p>
     <w:p>
       <w:pPr>
-        <w:pStyle w:val="935"/>
-        <w:keepNext w:val="true"/>
-        <w:pBdr/>
-        <w:spacing w:after="120" w:before="240" w:line="480" w:lineRule="auto"/>
-        <w:ind/>
-        <w:rPr/>
-      </w:pPr>
-      <w:r>
-        <w:rPr>
-          <w:rFonts w:ascii="Times New Roman" w:hAnsi="Times New Roman" w:eastAsia="Times New Roman" w:cs="Times New Roman"/>
-          <w:b/>
-          <w:bCs/>
-          <w:color w:val="000000"/>
-          <w:sz w:val="24"/>
-          <w:szCs w:val="24"/>
-          <w:rtl w:val="0"/>
-        </w:rPr>
-        <w:t xml:space="preserve">3.3.11  Customer Feedback &amp; Review System</w:t>
-      </w:r>
-      <w:r/>
-    </w:p>
-    <w:p>
-      <w:pPr>
-        <w:keepNext w:val="true"/>
-        <w:pBdr/>
-        <w:spacing w:after="120" w:before="0" w:line="480" w:lineRule="auto"/>
-        <w:ind/>
-        <w:jc w:val="both"/>
-        <w:rPr/>
-      </w:pPr>
-      <w:r>
-        <w:rPr>
-          <w:rtl w:val="0"/>
-        </w:rPr>
-        <w:t xml:space="preserve">The reviews section builds social proof and trust through verified purchase badges.</w:t>
-      </w:r>
-    </w:p>
-    <w:p>
-      <w:pPr>
         <w:keepNext w:val="false"/>
         <w:keepLines w:val="true"/>
         <w:pageBreakBefore w:val="false"/>
@@ -7694,7 +7612,7 @@
           <w:szCs w:val="24"/>
           <w:rtl w:val="0"/>
         </w:rPr>
-        <w:t xml:space="preserve">3.3.12  Responsive Navigation &amp; Meta Links</w:t>
+        <w:t>3.3.10  Responsive Navigation &amp; Meta Links</w:t>
       </w:r>
       <w:r/>
     </w:p>

</xml_diff>

<commit_message>
Rename Ashwin Sunuwar to Ashwin Sunar everywhere
</commit_message>
<xml_diff>
--- a/report/Lustro-Report by Ashwin Sunuwar.docx
+++ b/report/Lustro-Report by Ashwin Sunuwar.docx
@@ -480,7 +480,7 @@
           <w:bCs/>
           <w:rtl w:val="0"/>
         </w:rPr>
-        <w:t xml:space="preserve">Ashwin Sunuwar</w:t>
+        <w:t>Ashwin Sunar</w:t>
       </w:r>
       <w:r>
         <w:rPr>
@@ -830,7 +830,7 @@
           <w:bCs/>
           <w:rtl w:val="0"/>
         </w:rPr>
-        <w:t xml:space="preserve">Mr. Ashwin Sunuwar</w:t>
+        <w:t>Mr. Ashwin Sunar</w:t>
       </w:r>
       <w:r>
         <w:rPr>
@@ -1178,7 +1178,7 @@
           <w:bCs/>
           <w:rtl w:val="0"/>
         </w:rPr>
-        <w:t xml:space="preserve">Mr. Ashwin Sunuwar</w:t>
+        <w:t>Mr. Ashwin Sunar</w:t>
       </w:r>
       <w:r>
         <w:rPr>
@@ -1516,7 +1516,7 @@
           <w:bCs/>
           <w:rtl w:val="0"/>
         </w:rPr>
-        <w:t xml:space="preserve"> Ashwin Sunuwar</w:t>
+        <w:t xml:space="preserve"> Ashwin Sunar</w:t>
       </w:r>
       <w:r>
         <w:rPr>
@@ -1608,7 +1608,7 @@
           <w:bCs/>
           <w:rtl w:val="0"/>
         </w:rPr>
-        <w:t xml:space="preserve">Mr. Ashwin Sunuwar</w:t>
+        <w:t>Mr. Ashwin Sunar</w:t>
       </w:r>
       <w:r>
         <w:rPr>

</xml_diff>

<commit_message>
Remove 3.3.8 Cart section, renumber remaining
</commit_message>
<xml_diff>
--- a/report/Lustro-Report by Ashwin Sunuwar.docx
+++ b/report/Lustro-Report by Ashwin Sunuwar.docx
@@ -5071,38 +5071,6 @@
     </w:p>
     <w:p>
       <w:pPr>
-        <w:pStyle w:val="Heading3"/>
-        <w:keepNext w:val="true"/>
-        <w:spacing w:lineRule="auto" w:line="480" w:before="240" w:after="120"/>
-        <w:rPr/>
-      </w:pPr>
-      <w:r>
-        <w:rPr>
-          <w:rFonts w:eastAsia="Times New Roman" w:cs="Times New Roman"/>
-          <w:b/>
-          <w:bCs/>
-          <w:color w:val="000000"/>
-          <w:sz w:val="24"/>
-          <w:szCs w:val="24"/>
-        </w:rPr>
-        <w:t>3.3.8  Logic-Heavy Multi-Store Cart</w:t>
-      </w:r>
-    </w:p>
-    <w:p>
-      <w:pPr>
-        <w:pStyle w:val="Normal"/>
-        <w:keepNext w:val="true"/>
-        <w:spacing w:lineRule="auto" w:line="480" w:before="0" w:after="120"/>
-        <w:jc w:val="both"/>
-        <w:rPr/>
-      </w:pPr>
-      <w:r>
-        <w:rPr/>
-        <w:t>The cart supports quantity management, save-for-later, shipping and totals, and integrates with the wishlist and compare (max 3) features.</w:t>
-      </w:r>
-    </w:p>
-    <w:p>
-      <w:pPr>
         <w:pStyle w:val="Normal"/>
         <w:keepNext w:val="false"/>
         <w:keepLines/>
@@ -5169,7 +5137,7 @@
           <w:sz w:val="24"/>
           <w:szCs w:val="24"/>
         </w:rPr>
-        <w:t>3.3.9  Secure Multi-Step Checkout</w:t>
+        <w:t>3.3.8  Secure Multi-Step Checkout</w:t>
       </w:r>
     </w:p>
     <w:p>
@@ -5305,7 +5273,7 @@
           <w:sz w:val="24"/>
           <w:szCs w:val="24"/>
         </w:rPr>
-        <w:t>3.3.10  Responsive Navigation &amp; Meta Links</w:t>
+        <w:t>3.3.9  Responsive Navigation &amp; Meta Links</w:t>
       </w:r>
     </w:p>
     <w:p>

</xml_diff>

<commit_message>
Add review screenshot to report, create Samrat Acharya variant
</commit_message>
<xml_diff>
--- a/report/Lustro-Report by Ashwin Sunuwar.docx
+++ b/report/Lustro-Report by Ashwin Sunuwar.docx
@@ -5018,6 +5018,42 @@
       </w:r>
     </w:p>
     <w:p>
+      <w:r>
+        <w:drawing>
+          <wp:inline xmlns:a="http://schemas.openxmlformats.org/drawingml/2006/main">
+            <wp:extent cx="5029200" cy="2783555"/>
+            <wp:docPr id="12" name="Picture 12"/>
+            <wp:cNvGraphicFramePr>
+              <a:graphicFrameLocks noChangeAspect="1"/>
+            </wp:cNvGraphicFramePr>
+            <a:graphic>
+              <a:graphicData uri="http://schemas.openxmlformats.org/drawingml/2006/picture">
+                <pic:pic>
+                  <pic:nvPicPr>
+                    <pic:cNvPr id="0" name="review.png"/>
+                    <pic:cNvPicPr/>
+                  </pic:nvPicPr>
+                  <pic:blipFill>
+                    <a:blip r:embed="rId27"/>
+                    <a:stretch>
+                      <a:fillRect/>
+                    </a:stretch>
+                  </pic:blipFill>
+                  <pic:spPr>
+                    <a:xfrm>
+                      <a:off x="0" y="0"/>
+                      <a:ext cx="5029200" cy="2783555"/>
+                    </a:xfrm>
+                    <a:prstGeom prst="rect"/>
+                  </pic:spPr>
+                </pic:pic>
+              </a:graphicData>
+            </a:graphic>
+          </wp:inline>
+        </w:drawing>
+      </w:r>
+    </w:p>
+    <w:p>
       <w:pPr>
         <w:pStyle w:val="Normal"/>
         <w:keepNext w:val="false"/>

</xml_diff>

<commit_message>
Fix report: review image with caption, remove mid-para bold, fix Tailwind CSS bold in refs
</commit_message>
<xml_diff>
--- a/report/Lustro-Report by Ashwin Sunuwar.docx
+++ b/report/Lustro-Report by Ashwin Sunuwar.docx
@@ -53,7 +53,6 @@
       </w:r>
       <w:r>
         <w:rPr>
-          <w:b/>
           <w:bCs/>
           <w:sz w:val="28"/>
           <w:szCs w:val="28"/>
@@ -462,7 +461,6 @@
       </w:r>
       <w:r>
         <w:rPr>
-          <w:b/>
           <w:bCs/>
         </w:rPr>
         <w:t>On-the-Job Training (OJT)</w:t>
@@ -473,7 +471,6 @@
       </w:r>
       <w:r>
         <w:rPr>
-          <w:b/>
           <w:bCs/>
         </w:rPr>
         <w:t>"Lustro E-commerce Platform"</w:t>
@@ -484,7 +481,6 @@
       </w:r>
       <w:r>
         <w:rPr>
-          <w:b/>
           <w:bCs/>
         </w:rPr>
         <w:t>Mr. Ashwin Sunar</w:t>
@@ -495,7 +491,6 @@
       </w:r>
       <w:r>
         <w:rPr>
-          <w:b/>
           <w:bCs/>
         </w:rPr>
         <w:t>Grade 10 at Shivapuri Secondary School</w:t>
@@ -506,7 +501,6 @@
       </w:r>
       <w:r>
         <w:rPr>
-          <w:b/>
           <w:bCs/>
         </w:rPr>
         <w:t>academic year 2082/83</w:t>
@@ -541,7 +535,6 @@
       </w:r>
       <w:r>
         <w:rPr>
-          <w:b/>
           <w:bCs/>
         </w:rPr>
         <w:t xml:space="preserve">academic year 2082 </w:t>
@@ -714,7 +707,6 @@
       </w:r>
       <w:r>
         <w:rPr>
-          <w:b/>
           <w:bCs/>
         </w:rPr>
         <w:t>Mr. Ashwin Sunar</w:t>
@@ -725,7 +717,6 @@
       </w:r>
       <w:r>
         <w:rPr>
-          <w:b/>
           <w:bCs/>
         </w:rPr>
         <w:t>On-the-Job Training (OJT)</w:t>
@@ -736,7 +727,6 @@
       </w:r>
       <w:r>
         <w:rPr>
-          <w:b/>
           <w:bCs/>
         </w:rPr>
         <w:t>Computer Engineering curriculum under the Technical Stream</w:t>
@@ -747,7 +737,6 @@
       </w:r>
       <w:r>
         <w:rPr>
-          <w:b/>
           <w:bCs/>
         </w:rPr>
         <w:t xml:space="preserve"> 2082B.S.</w:t>
@@ -766,7 +755,6 @@
       </w:r>
       <w:r>
         <w:rPr>
-          <w:b/>
           <w:bCs/>
         </w:rPr>
         <w:t>Lustro E-commerce Platform.</w:t>
@@ -943,7 +931,6 @@
       </w:r>
       <w:r>
         <w:rPr>
-          <w:b/>
           <w:bCs/>
         </w:rPr>
         <w:t xml:space="preserve"> Ashwin Sunar</w:t>
@@ -954,7 +941,6 @@
       </w:r>
       <w:r>
         <w:rPr>
-          <w:b/>
           <w:bCs/>
         </w:rPr>
         <w:t>Computer Engineering</w:t>
@@ -1171,7 +1157,6 @@
       </w:r>
       <w:r>
         <w:rPr>
-          <w:b/>
           <w:bCs/>
         </w:rPr>
         <w:t>Er. Sagun Babu Adhikari</w:t>
@@ -1194,7 +1179,6 @@
       </w:r>
       <w:r>
         <w:rPr>
-          <w:b/>
           <w:bCs/>
         </w:rPr>
         <w:t>Mrs. Sindhu Tuladha</w:t>
@@ -1217,7 +1201,6 @@
       </w:r>
       <w:r>
         <w:rPr>
-          <w:b/>
           <w:bCs/>
         </w:rPr>
         <w:t>Shivapuri Secondary School</w:t>
@@ -1228,7 +1211,6 @@
       </w:r>
       <w:r>
         <w:rPr>
-          <w:b/>
           <w:bCs/>
         </w:rPr>
         <w:t>Department of Computer Engineering</w:t>
@@ -1333,7 +1315,6 @@
       </w:r>
       <w:r>
         <w:rPr>
-          <w:b/>
           <w:bCs/>
         </w:rPr>
         <w:t>Page No.</w:t>
@@ -3742,7 +3723,6 @@
       </w:r>
       <w:r>
         <w:rPr>
-          <w:b/>
           <w:bCs/>
         </w:rPr>
         <w:t>e On-the-Job Training (OJT)</w:t>
@@ -3753,7 +3733,6 @@
       </w:r>
       <w:r>
         <w:rPr>
-          <w:b/>
           <w:bCs/>
         </w:rPr>
         <w:t>Computer Engineering Department</w:t>
@@ -3764,7 +3743,6 @@
       </w:r>
       <w:r>
         <w:rPr>
-          <w:b/>
           <w:bCs/>
         </w:rPr>
         <w:t>academic year 2082/83</w:t>
@@ -3799,7 +3777,6 @@
       </w:r>
       <w:r>
         <w:rPr>
-          <w:b/>
           <w:bCs/>
         </w:rPr>
         <w:t>full-stack web development</w:t>
@@ -5006,22 +4983,24 @@
     </w:p>
     <w:p>
       <w:pPr>
-        <w:pStyle w:val="Normal"/>
-        <w:keepNext w:val="true"/>
-        <w:spacing w:lineRule="auto" w:line="480" w:before="0" w:after="120"/>
-        <w:jc w:val="both"/>
-        <w:rPr/>
+        <w:jc w:val="center"/>
       </w:pPr>
       <w:r>
-        <w:rPr/>
-        <w:t>The product detail page presents a gallery, full technical specifications, verified collector reviews, related pieces, and a waitlist for sold-out timepieces.</w:t>
+        <w:rPr>
+          <w:i/>
+          <w:sz w:val="18"/>
+        </w:rPr>
+        <w:t>Figure: Collector Reviews section with verified purchase badges and rating breakdown</w:t>
       </w:r>
     </w:p>
     <w:p>
+      <w:pPr>
+        <w:jc w:val="center"/>
+      </w:pPr>
       <w:r>
         <w:drawing>
           <wp:inline xmlns:a="http://schemas.openxmlformats.org/drawingml/2006/main">
-            <wp:extent cx="5029200" cy="2783555"/>
+            <wp:extent cx="4572000" cy="2530505"/>
             <wp:docPr id="12" name="Picture 12"/>
             <wp:cNvGraphicFramePr>
               <a:graphicFrameLocks noChangeAspect="1"/>
@@ -5042,7 +5021,7 @@
                   <pic:spPr>
                     <a:xfrm>
                       <a:off x="0" y="0"/>
-                      <a:ext cx="5029200" cy="2783555"/>
+                      <a:ext cx="4572000" cy="2530505"/>
                     </a:xfrm>
                     <a:prstGeom prst="rect"/>
                   </pic:spPr>
@@ -5051,6 +5030,19 @@
             </a:graphic>
           </wp:inline>
         </w:drawing>
+      </w:r>
+    </w:p>
+    <w:p>
+      <w:pPr>
+        <w:pStyle w:val="Normal"/>
+        <w:keepNext w:val="true"/>
+        <w:spacing w:lineRule="auto" w:line="480" w:before="0" w:after="120"/>
+        <w:jc w:val="both"/>
+        <w:rPr/>
+      </w:pPr>
+      <w:r>
+        <w:rPr/>
+        <w:t>The product detail page presents a gallery, full technical specifications, verified collector reviews, related pieces, and a waitlist for sold-out timepieces.</w:t>
       </w:r>
     </w:p>
     <w:p>
@@ -5618,7 +5610,6 @@
       </w:r>
       <w:r>
         <w:rPr>
-          <w:b/>
           <w:bCs/>
         </w:rPr>
         <w:t>Lustro</w:t>
@@ -6681,7 +6672,6 @@
       </w:r>
       <w:r>
         <w:rPr>
-          <w:b/>
           <w:bCs/>
         </w:rPr>
         <w:t>Django REST Framework</w:t>
@@ -6703,7 +6693,6 @@
       </w:r>
       <w:r>
         <w:rPr>
-          <w:b/>
           <w:bCs/>
         </w:rPr>
         <w:t>React + Vite</w:t>
@@ -6725,7 +6714,6 @@
       </w:r>
       <w:r>
         <w:rPr>
-          <w:b/>
           <w:bCs/>
         </w:rPr>
         <w:t>Three.js</w:t>
@@ -6742,7 +6730,9 @@
         <w:rPr/>
       </w:pPr>
       <w:r>
-        <w:rPr/>
+        <w:rPr>
+          <w:b/>
+        </w:rPr>
         <w:t>4.  Tailwind CSS (Styling): https://tailwindcss.com</w:t>
       </w:r>
     </w:p>

</xml_diff>

<commit_message>
Add 3.3.8 Customer Reviews section with screenshot and caption
</commit_message>
<xml_diff>
--- a/report/Lustro-Report by Ashwin Sunuwar.docx
+++ b/report/Lustro-Report by Ashwin Sunuwar.docx
@@ -4983,57 +4983,6 @@
     </w:p>
     <w:p>
       <w:pPr>
-        <w:jc w:val="center"/>
-      </w:pPr>
-      <w:r>
-        <w:rPr>
-          <w:i/>
-          <w:sz w:val="18"/>
-        </w:rPr>
-        <w:t>Figure: Collector Reviews section with verified purchase badges and rating breakdown</w:t>
-      </w:r>
-    </w:p>
-    <w:p>
-      <w:pPr>
-        <w:jc w:val="center"/>
-      </w:pPr>
-      <w:r>
-        <w:drawing>
-          <wp:inline xmlns:a="http://schemas.openxmlformats.org/drawingml/2006/main">
-            <wp:extent cx="4572000" cy="2530505"/>
-            <wp:docPr id="12" name="Picture 12"/>
-            <wp:cNvGraphicFramePr>
-              <a:graphicFrameLocks noChangeAspect="1"/>
-            </wp:cNvGraphicFramePr>
-            <a:graphic>
-              <a:graphicData uri="http://schemas.openxmlformats.org/drawingml/2006/picture">
-                <pic:pic>
-                  <pic:nvPicPr>
-                    <pic:cNvPr id="0" name="review.png"/>
-                    <pic:cNvPicPr/>
-                  </pic:nvPicPr>
-                  <pic:blipFill>
-                    <a:blip r:embed="rId27"/>
-                    <a:stretch>
-                      <a:fillRect/>
-                    </a:stretch>
-                  </pic:blipFill>
-                  <pic:spPr>
-                    <a:xfrm>
-                      <a:off x="0" y="0"/>
-                      <a:ext cx="4572000" cy="2530505"/>
-                    </a:xfrm>
-                    <a:prstGeom prst="rect"/>
-                  </pic:spPr>
-                </pic:pic>
-              </a:graphicData>
-            </a:graphic>
-          </wp:inline>
-        </w:drawing>
-      </w:r>
-    </w:p>
-    <w:p>
-      <w:pPr>
         <w:pStyle w:val="Normal"/>
         <w:keepNext w:val="true"/>
         <w:spacing w:lineRule="auto" w:line="480" w:before="0" w:after="120"/>
@@ -5152,6 +5101,74 @@
     <w:p>
       <w:pPr>
         <w:pStyle w:val="Heading3"/>
+      </w:pPr>
+      <w:r>
+        <w:rPr>
+          <w:b/>
+        </w:rPr>
+        <w:t>3.3.8  Customer Reviews &amp; Ratings</w:t>
+      </w:r>
+    </w:p>
+    <w:p>
+      <w:r>
+        <w:t>The reviews section builds social proof through verified purchase badges, star ratings, and detailed collector feedback. Users can filter by rating, sort by recency, and submit their own reviews after purchase.</w:t>
+      </w:r>
+    </w:p>
+    <w:p>
+      <w:pPr>
+        <w:jc w:val="center"/>
+      </w:pPr>
+      <w:r>
+        <w:drawing>
+          <wp:inline xmlns:a="http://schemas.openxmlformats.org/drawingml/2006/main">
+            <wp:extent cx="4572000" cy="2530505"/>
+            <wp:docPr id="12" name="Picture 12"/>
+            <wp:cNvGraphicFramePr>
+              <a:graphicFrameLocks noChangeAspect="1"/>
+            </wp:cNvGraphicFramePr>
+            <a:graphic>
+              <a:graphicData uri="http://schemas.openxmlformats.org/drawingml/2006/picture">
+                <pic:pic>
+                  <pic:nvPicPr>
+                    <pic:cNvPr id="0" name="review.png"/>
+                    <pic:cNvPicPr/>
+                  </pic:nvPicPr>
+                  <pic:blipFill>
+                    <a:blip r:embed="rId27"/>
+                    <a:stretch>
+                      <a:fillRect/>
+                    </a:stretch>
+                  </pic:blipFill>
+                  <pic:spPr>
+                    <a:xfrm>
+                      <a:off x="0" y="0"/>
+                      <a:ext cx="4572000" cy="2530505"/>
+                    </a:xfrm>
+                    <a:prstGeom prst="rect"/>
+                  </pic:spPr>
+                </pic:pic>
+              </a:graphicData>
+            </a:graphic>
+          </wp:inline>
+        </w:drawing>
+      </w:r>
+    </w:p>
+    <w:p>
+      <w:pPr>
+        <w:jc w:val="center"/>
+      </w:pPr>
+      <w:r>
+        <w:rPr>
+          <w:i/>
+          <w:sz w:val="18"/>
+        </w:rPr>
+        <w:t>Figure: Collector Reviews section with verified purchase badges and rating breakdown</w:t>
+      </w:r>
+    </w:p>
+    <w:p/>
+    <w:p>
+      <w:pPr>
+        <w:pStyle w:val="Heading3"/>
         <w:keepNext w:val="true"/>
         <w:spacing w:lineRule="auto" w:line="480" w:before="240" w:after="120"/>
         <w:rPr/>
@@ -5165,7 +5182,7 @@
           <w:sz w:val="24"/>
           <w:szCs w:val="24"/>
         </w:rPr>
-        <w:t>3.3.8  Secure Multi-Step Checkout</w:t>
+        <w:t>3.3.9  Secure Multi-Step Checkout</w:t>
       </w:r>
     </w:p>
     <w:p>
@@ -5301,7 +5318,7 @@
           <w:sz w:val="24"/>
           <w:szCs w:val="24"/>
         </w:rPr>
-        <w:t>3.3.9  Responsive Navigation &amp; Meta Links</w:t>
+        <w:t>3.3.10  Responsive Navigation &amp; Meta Links</w:t>
       </w:r>
     </w:p>
     <w:p>

</xml_diff>